<commit_message>
feat: add complete OBE curriculum revision documents and tracking matrices for SISTEKIN 2026
</commit_message>
<xml_diff>
--- a/KURIKULUM2026_REVISI/DOCX/000_CHANGELOG_ALIGNMENT_FINAL.docx
+++ b/KURIKULUM2026_REVISI/DOCX/000_CHANGELOG_ALIGNMENT_FINAL.docx
@@ -77,9 +77,9 @@
       <w:r>
         <w:rPr>
           <w:color w:val="C8D2E1"/>
-          <w:sz w:val="16"/>
+          <w:sz w:val="14"/>
         </w:rPr>
-        <w:t>_________________________________________________________________________________</w:t>
+        <w:t>———————————————————————————————————————————————————————————————————————————</w:t>
       </w:r>
     </w:p>
     <w:p>
@@ -128,9 +128,9 @@
         </w:tblBorders>
       </w:tblPr>
       <w:tblGrid>
-        <w:gridCol w:w="3010"/>
-        <w:gridCol w:w="3010"/>
-        <w:gridCol w:w="3010"/>
+        <w:gridCol w:w="3202"/>
+        <w:gridCol w:w="3202"/>
+        <w:gridCol w:w="3202"/>
       </w:tblGrid>
       <w:tr>
         <w:trPr>
@@ -140,7 +140,7 @@
         </w:trPr>
         <w:tc>
           <w:tcPr>
-            <w:tcW w:type="dxa" w:w="3010"/>
+            <w:tcW w:type="dxa" w:w="3202"/>
             <w:vAlign w:val="center"/>
             <w:shd w:fill="1F3864"/>
             <w:tcMar>
@@ -168,7 +168,7 @@
         </w:tc>
         <w:tc>
           <w:tcPr>
-            <w:tcW w:type="dxa" w:w="3010"/>
+            <w:tcW w:type="dxa" w:w="3202"/>
             <w:vAlign w:val="center"/>
             <w:shd w:fill="1F3864"/>
             <w:tcMar>
@@ -196,7 +196,7 @@
         </w:tc>
         <w:tc>
           <w:tcPr>
-            <w:tcW w:type="dxa" w:w="3010"/>
+            <w:tcW w:type="dxa" w:w="3202"/>
             <w:vAlign w:val="center"/>
             <w:shd w:fill="1F3864"/>
             <w:tcMar>
@@ -229,14 +229,14 @@
         </w:trPr>
         <w:tc>
           <w:tcPr>
-            <w:tcW w:type="dxa" w:w="3010"/>
+            <w:tcW w:type="dxa" w:w="3202"/>
             <w:vAlign w:val="center"/>
             <w:shd w:fill="FFFFFF"/>
             <w:tcMar>
-              <w:top w:w="80" w:type="dxa"/>
-              <w:bottom w:w="80" w:type="dxa"/>
-              <w:left w:w="100" w:type="dxa"/>
-              <w:right w:w="100" w:type="dxa"/>
+              <w:top w:w="70" w:type="dxa"/>
+              <w:bottom w:w="70" w:type="dxa"/>
+              <w:left w:w="90" w:type="dxa"/>
+              <w:right w:w="90" w:type="dxa"/>
             </w:tcMar>
           </w:tcPr>
           <w:p>
@@ -257,14 +257,14 @@
         </w:tc>
         <w:tc>
           <w:tcPr>
-            <w:tcW w:type="dxa" w:w="3010"/>
+            <w:tcW w:type="dxa" w:w="3202"/>
             <w:vAlign w:val="center"/>
             <w:shd w:fill="FFFFFF"/>
             <w:tcMar>
-              <w:top w:w="80" w:type="dxa"/>
-              <w:bottom w:w="80" w:type="dxa"/>
-              <w:left w:w="100" w:type="dxa"/>
-              <w:right w:w="100" w:type="dxa"/>
+              <w:top w:w="70" w:type="dxa"/>
+              <w:bottom w:w="70" w:type="dxa"/>
+              <w:left w:w="90" w:type="dxa"/>
+              <w:right w:w="90" w:type="dxa"/>
             </w:tcMar>
           </w:tcPr>
           <w:p>
@@ -285,14 +285,14 @@
         </w:tc>
         <w:tc>
           <w:tcPr>
-            <w:tcW w:type="dxa" w:w="3010"/>
+            <w:tcW w:type="dxa" w:w="3202"/>
             <w:vAlign w:val="center"/>
             <w:shd w:fill="FFFFFF"/>
             <w:tcMar>
-              <w:top w:w="80" w:type="dxa"/>
-              <w:bottom w:w="80" w:type="dxa"/>
-              <w:left w:w="100" w:type="dxa"/>
-              <w:right w:w="100" w:type="dxa"/>
+              <w:top w:w="70" w:type="dxa"/>
+              <w:bottom w:w="70" w:type="dxa"/>
+              <w:left w:w="90" w:type="dxa"/>
+              <w:right w:w="90" w:type="dxa"/>
             </w:tcMar>
           </w:tcPr>
           <w:p>
@@ -317,14 +317,14 @@
         </w:trPr>
         <w:tc>
           <w:tcPr>
-            <w:tcW w:type="dxa" w:w="3010"/>
+            <w:tcW w:type="dxa" w:w="3202"/>
             <w:vAlign w:val="center"/>
             <w:shd w:fill="F2F5F9"/>
             <w:tcMar>
-              <w:top w:w="80" w:type="dxa"/>
-              <w:bottom w:w="80" w:type="dxa"/>
-              <w:left w:w="100" w:type="dxa"/>
-              <w:right w:w="100" w:type="dxa"/>
+              <w:top w:w="70" w:type="dxa"/>
+              <w:bottom w:w="70" w:type="dxa"/>
+              <w:left w:w="90" w:type="dxa"/>
+              <w:right w:w="90" w:type="dxa"/>
             </w:tcMar>
           </w:tcPr>
           <w:p>
@@ -345,14 +345,14 @@
         </w:tc>
         <w:tc>
           <w:tcPr>
-            <w:tcW w:type="dxa" w:w="3010"/>
+            <w:tcW w:type="dxa" w:w="3202"/>
             <w:vAlign w:val="center"/>
             <w:shd w:fill="F2F5F9"/>
             <w:tcMar>
-              <w:top w:w="80" w:type="dxa"/>
-              <w:bottom w:w="80" w:type="dxa"/>
-              <w:left w:w="100" w:type="dxa"/>
-              <w:right w:w="100" w:type="dxa"/>
+              <w:top w:w="70" w:type="dxa"/>
+              <w:bottom w:w="70" w:type="dxa"/>
+              <w:left w:w="90" w:type="dxa"/>
+              <w:right w:w="90" w:type="dxa"/>
             </w:tcMar>
           </w:tcPr>
           <w:p>
@@ -373,14 +373,14 @@
         </w:tc>
         <w:tc>
           <w:tcPr>
-            <w:tcW w:type="dxa" w:w="3010"/>
+            <w:tcW w:type="dxa" w:w="3202"/>
             <w:vAlign w:val="center"/>
             <w:shd w:fill="F2F5F9"/>
             <w:tcMar>
-              <w:top w:w="80" w:type="dxa"/>
-              <w:bottom w:w="80" w:type="dxa"/>
-              <w:left w:w="100" w:type="dxa"/>
-              <w:right w:w="100" w:type="dxa"/>
+              <w:top w:w="70" w:type="dxa"/>
+              <w:bottom w:w="70" w:type="dxa"/>
+              <w:left w:w="90" w:type="dxa"/>
+              <w:right w:w="90" w:type="dxa"/>
             </w:tcMar>
           </w:tcPr>
           <w:p>
@@ -405,14 +405,14 @@
         </w:trPr>
         <w:tc>
           <w:tcPr>
-            <w:tcW w:type="dxa" w:w="3010"/>
+            <w:tcW w:type="dxa" w:w="3202"/>
             <w:vAlign w:val="center"/>
             <w:shd w:fill="FFFFFF"/>
             <w:tcMar>
-              <w:top w:w="80" w:type="dxa"/>
-              <w:bottom w:w="80" w:type="dxa"/>
-              <w:left w:w="100" w:type="dxa"/>
-              <w:right w:w="100" w:type="dxa"/>
+              <w:top w:w="70" w:type="dxa"/>
+              <w:bottom w:w="70" w:type="dxa"/>
+              <w:left w:w="90" w:type="dxa"/>
+              <w:right w:w="90" w:type="dxa"/>
             </w:tcMar>
           </w:tcPr>
           <w:p>
@@ -433,14 +433,14 @@
         </w:tc>
         <w:tc>
           <w:tcPr>
-            <w:tcW w:type="dxa" w:w="3010"/>
+            <w:tcW w:type="dxa" w:w="3202"/>
             <w:vAlign w:val="center"/>
             <w:shd w:fill="FFFFFF"/>
             <w:tcMar>
-              <w:top w:w="80" w:type="dxa"/>
-              <w:bottom w:w="80" w:type="dxa"/>
-              <w:left w:w="100" w:type="dxa"/>
-              <w:right w:w="100" w:type="dxa"/>
+              <w:top w:w="70" w:type="dxa"/>
+              <w:bottom w:w="70" w:type="dxa"/>
+              <w:left w:w="90" w:type="dxa"/>
+              <w:right w:w="90" w:type="dxa"/>
             </w:tcMar>
           </w:tcPr>
           <w:p>
@@ -461,14 +461,14 @@
         </w:tc>
         <w:tc>
           <w:tcPr>
-            <w:tcW w:type="dxa" w:w="3010"/>
+            <w:tcW w:type="dxa" w:w="3202"/>
             <w:vAlign w:val="center"/>
             <w:shd w:fill="FFFFFF"/>
             <w:tcMar>
-              <w:top w:w="80" w:type="dxa"/>
-              <w:bottom w:w="80" w:type="dxa"/>
-              <w:left w:w="100" w:type="dxa"/>
-              <w:right w:w="100" w:type="dxa"/>
+              <w:top w:w="70" w:type="dxa"/>
+              <w:bottom w:w="70" w:type="dxa"/>
+              <w:left w:w="90" w:type="dxa"/>
+              <w:right w:w="90" w:type="dxa"/>
             </w:tcMar>
           </w:tcPr>
           <w:p>
@@ -493,14 +493,14 @@
         </w:trPr>
         <w:tc>
           <w:tcPr>
-            <w:tcW w:type="dxa" w:w="3010"/>
+            <w:tcW w:type="dxa" w:w="3202"/>
             <w:vAlign w:val="center"/>
             <w:shd w:fill="F2F5F9"/>
             <w:tcMar>
-              <w:top w:w="80" w:type="dxa"/>
-              <w:bottom w:w="80" w:type="dxa"/>
-              <w:left w:w="100" w:type="dxa"/>
-              <w:right w:w="100" w:type="dxa"/>
+              <w:top w:w="70" w:type="dxa"/>
+              <w:bottom w:w="70" w:type="dxa"/>
+              <w:left w:w="90" w:type="dxa"/>
+              <w:right w:w="90" w:type="dxa"/>
             </w:tcMar>
           </w:tcPr>
           <w:p>
@@ -521,14 +521,14 @@
         </w:tc>
         <w:tc>
           <w:tcPr>
-            <w:tcW w:type="dxa" w:w="3010"/>
+            <w:tcW w:type="dxa" w:w="3202"/>
             <w:vAlign w:val="center"/>
             <w:shd w:fill="F2F5F9"/>
             <w:tcMar>
-              <w:top w:w="80" w:type="dxa"/>
-              <w:bottom w:w="80" w:type="dxa"/>
-              <w:left w:w="100" w:type="dxa"/>
-              <w:right w:w="100" w:type="dxa"/>
+              <w:top w:w="70" w:type="dxa"/>
+              <w:bottom w:w="70" w:type="dxa"/>
+              <w:left w:w="90" w:type="dxa"/>
+              <w:right w:w="90" w:type="dxa"/>
             </w:tcMar>
           </w:tcPr>
           <w:p>
@@ -548,14 +548,14 @@
         </w:tc>
         <w:tc>
           <w:tcPr>
-            <w:tcW w:type="dxa" w:w="3010"/>
+            <w:tcW w:type="dxa" w:w="3202"/>
             <w:vAlign w:val="center"/>
             <w:shd w:fill="F2F5F9"/>
             <w:tcMar>
-              <w:top w:w="80" w:type="dxa"/>
-              <w:bottom w:w="80" w:type="dxa"/>
-              <w:left w:w="100" w:type="dxa"/>
-              <w:right w:w="100" w:type="dxa"/>
+              <w:top w:w="70" w:type="dxa"/>
+              <w:bottom w:w="70" w:type="dxa"/>
+              <w:left w:w="90" w:type="dxa"/>
+              <w:right w:w="90" w:type="dxa"/>
             </w:tcMar>
           </w:tcPr>
           <w:p>
@@ -580,14 +580,14 @@
         </w:trPr>
         <w:tc>
           <w:tcPr>
-            <w:tcW w:type="dxa" w:w="3010"/>
+            <w:tcW w:type="dxa" w:w="3202"/>
             <w:vAlign w:val="center"/>
             <w:shd w:fill="FFFFFF"/>
             <w:tcMar>
-              <w:top w:w="80" w:type="dxa"/>
-              <w:bottom w:w="80" w:type="dxa"/>
-              <w:left w:w="100" w:type="dxa"/>
-              <w:right w:w="100" w:type="dxa"/>
+              <w:top w:w="70" w:type="dxa"/>
+              <w:bottom w:w="70" w:type="dxa"/>
+              <w:left w:w="90" w:type="dxa"/>
+              <w:right w:w="90" w:type="dxa"/>
             </w:tcMar>
           </w:tcPr>
           <w:p>
@@ -608,14 +608,14 @@
         </w:tc>
         <w:tc>
           <w:tcPr>
-            <w:tcW w:type="dxa" w:w="3010"/>
+            <w:tcW w:type="dxa" w:w="3202"/>
             <w:vAlign w:val="center"/>
             <w:shd w:fill="FFFFFF"/>
             <w:tcMar>
-              <w:top w:w="80" w:type="dxa"/>
-              <w:bottom w:w="80" w:type="dxa"/>
-              <w:left w:w="100" w:type="dxa"/>
-              <w:right w:w="100" w:type="dxa"/>
+              <w:top w:w="70" w:type="dxa"/>
+              <w:bottom w:w="70" w:type="dxa"/>
+              <w:left w:w="90" w:type="dxa"/>
+              <w:right w:w="90" w:type="dxa"/>
             </w:tcMar>
           </w:tcPr>
           <w:p>
@@ -635,14 +635,14 @@
         </w:tc>
         <w:tc>
           <w:tcPr>
-            <w:tcW w:type="dxa" w:w="3010"/>
+            <w:tcW w:type="dxa" w:w="3202"/>
             <w:vAlign w:val="center"/>
             <w:shd w:fill="FFFFFF"/>
             <w:tcMar>
-              <w:top w:w="80" w:type="dxa"/>
-              <w:bottom w:w="80" w:type="dxa"/>
-              <w:left w:w="100" w:type="dxa"/>
-              <w:right w:w="100" w:type="dxa"/>
+              <w:top w:w="70" w:type="dxa"/>
+              <w:bottom w:w="70" w:type="dxa"/>
+              <w:left w:w="90" w:type="dxa"/>
+              <w:right w:w="90" w:type="dxa"/>
             </w:tcMar>
           </w:tcPr>
           <w:p>
@@ -667,14 +667,14 @@
         </w:trPr>
         <w:tc>
           <w:tcPr>
-            <w:tcW w:type="dxa" w:w="3010"/>
+            <w:tcW w:type="dxa" w:w="3202"/>
             <w:vAlign w:val="center"/>
             <w:shd w:fill="F2F5F9"/>
             <w:tcMar>
-              <w:top w:w="80" w:type="dxa"/>
-              <w:bottom w:w="80" w:type="dxa"/>
-              <w:left w:w="100" w:type="dxa"/>
-              <w:right w:w="100" w:type="dxa"/>
+              <w:top w:w="70" w:type="dxa"/>
+              <w:bottom w:w="70" w:type="dxa"/>
+              <w:left w:w="90" w:type="dxa"/>
+              <w:right w:w="90" w:type="dxa"/>
             </w:tcMar>
           </w:tcPr>
           <w:p>
@@ -695,14 +695,14 @@
         </w:tc>
         <w:tc>
           <w:tcPr>
-            <w:tcW w:type="dxa" w:w="3010"/>
+            <w:tcW w:type="dxa" w:w="3202"/>
             <w:vAlign w:val="center"/>
             <w:shd w:fill="F2F5F9"/>
             <w:tcMar>
-              <w:top w:w="80" w:type="dxa"/>
-              <w:bottom w:w="80" w:type="dxa"/>
-              <w:left w:w="100" w:type="dxa"/>
-              <w:right w:w="100" w:type="dxa"/>
+              <w:top w:w="70" w:type="dxa"/>
+              <w:bottom w:w="70" w:type="dxa"/>
+              <w:left w:w="90" w:type="dxa"/>
+              <w:right w:w="90" w:type="dxa"/>
             </w:tcMar>
           </w:tcPr>
           <w:p>
@@ -722,14 +722,14 @@
         </w:tc>
         <w:tc>
           <w:tcPr>
-            <w:tcW w:type="dxa" w:w="3010"/>
+            <w:tcW w:type="dxa" w:w="3202"/>
             <w:vAlign w:val="center"/>
             <w:shd w:fill="F2F5F9"/>
             <w:tcMar>
-              <w:top w:w="80" w:type="dxa"/>
-              <w:bottom w:w="80" w:type="dxa"/>
-              <w:left w:w="100" w:type="dxa"/>
-              <w:right w:w="100" w:type="dxa"/>
+              <w:top w:w="70" w:type="dxa"/>
+              <w:bottom w:w="70" w:type="dxa"/>
+              <w:left w:w="90" w:type="dxa"/>
+              <w:right w:w="90" w:type="dxa"/>
             </w:tcMar>
           </w:tcPr>
           <w:p>
@@ -751,7 +751,7 @@
     </w:tbl>
     <w:p>
       <w:pPr>
-        <w:spacing w:after="120"/>
+        <w:spacing w:after="100"/>
       </w:pPr>
     </w:p>
     <w:p>
@@ -761,9 +761,9 @@
       <w:r>
         <w:rPr>
           <w:color w:val="C8D2E1"/>
-          <w:sz w:val="16"/>
+          <w:sz w:val="14"/>
         </w:rPr>
-        <w:t>_________________________________________________________________________________</w:t>
+        <w:t>———————————————————————————————————————————————————————————————————————————</w:t>
       </w:r>
     </w:p>
     <w:p>
@@ -1139,9 +1139,9 @@
       <w:r>
         <w:rPr>
           <w:color w:val="C8D2E1"/>
-          <w:sz w:val="16"/>
+          <w:sz w:val="14"/>
         </w:rPr>
-        <w:t>_________________________________________________________________________________</w:t>
+        <w:t>———————————————————————————————————————————————————————————————————————————</w:t>
       </w:r>
     </w:p>
     <w:p>
@@ -1175,10 +1175,10 @@
         </w:tblBorders>
       </w:tblPr>
       <w:tblGrid>
-        <w:gridCol w:w="2257"/>
-        <w:gridCol w:w="2257"/>
-        <w:gridCol w:w="2257"/>
-        <w:gridCol w:w="2257"/>
+        <w:gridCol w:w="2401"/>
+        <w:gridCol w:w="2401"/>
+        <w:gridCol w:w="2401"/>
+        <w:gridCol w:w="2401"/>
       </w:tblGrid>
       <w:tr>
         <w:trPr>
@@ -1188,7 +1188,7 @@
         </w:trPr>
         <w:tc>
           <w:tcPr>
-            <w:tcW w:type="dxa" w:w="2257"/>
+            <w:tcW w:type="dxa" w:w="2401"/>
             <w:vAlign w:val="center"/>
             <w:shd w:fill="1F3864"/>
             <w:tcMar>
@@ -1216,7 +1216,7 @@
         </w:tc>
         <w:tc>
           <w:tcPr>
-            <w:tcW w:type="dxa" w:w="2257"/>
+            <w:tcW w:type="dxa" w:w="2401"/>
             <w:vAlign w:val="center"/>
             <w:shd w:fill="1F3864"/>
             <w:tcMar>
@@ -1244,7 +1244,7 @@
         </w:tc>
         <w:tc>
           <w:tcPr>
-            <w:tcW w:type="dxa" w:w="2257"/>
+            <w:tcW w:type="dxa" w:w="2401"/>
             <w:vAlign w:val="center"/>
             <w:shd w:fill="1F3864"/>
             <w:tcMar>
@@ -1272,7 +1272,7 @@
         </w:tc>
         <w:tc>
           <w:tcPr>
-            <w:tcW w:type="dxa" w:w="2257"/>
+            <w:tcW w:type="dxa" w:w="2401"/>
             <w:vAlign w:val="center"/>
             <w:shd w:fill="1F3864"/>
             <w:tcMar>
@@ -1305,14 +1305,14 @@
         </w:trPr>
         <w:tc>
           <w:tcPr>
-            <w:tcW w:type="dxa" w:w="2257"/>
+            <w:tcW w:type="dxa" w:w="2401"/>
             <w:vAlign w:val="center"/>
             <w:shd w:fill="FFFFFF"/>
             <w:tcMar>
-              <w:top w:w="80" w:type="dxa"/>
-              <w:bottom w:w="80" w:type="dxa"/>
-              <w:left w:w="100" w:type="dxa"/>
-              <w:right w:w="100" w:type="dxa"/>
+              <w:top w:w="70" w:type="dxa"/>
+              <w:bottom w:w="70" w:type="dxa"/>
+              <w:left w:w="90" w:type="dxa"/>
+              <w:right w:w="90" w:type="dxa"/>
             </w:tcMar>
           </w:tcPr>
           <w:p>
@@ -1333,14 +1333,14 @@
         </w:tc>
         <w:tc>
           <w:tcPr>
-            <w:tcW w:type="dxa" w:w="2257"/>
+            <w:tcW w:type="dxa" w:w="2401"/>
             <w:vAlign w:val="center"/>
             <w:shd w:fill="FFFFFF"/>
             <w:tcMar>
-              <w:top w:w="80" w:type="dxa"/>
-              <w:bottom w:w="80" w:type="dxa"/>
-              <w:left w:w="100" w:type="dxa"/>
-              <w:right w:w="100" w:type="dxa"/>
+              <w:top w:w="70" w:type="dxa"/>
+              <w:bottom w:w="70" w:type="dxa"/>
+              <w:left w:w="90" w:type="dxa"/>
+              <w:right w:w="90" w:type="dxa"/>
             </w:tcMar>
           </w:tcPr>
           <w:p>
@@ -1360,14 +1360,14 @@
         </w:tc>
         <w:tc>
           <w:tcPr>
-            <w:tcW w:type="dxa" w:w="2257"/>
+            <w:tcW w:type="dxa" w:w="2401"/>
             <w:vAlign w:val="center"/>
             <w:shd w:fill="FFFFFF"/>
             <w:tcMar>
-              <w:top w:w="80" w:type="dxa"/>
-              <w:bottom w:w="80" w:type="dxa"/>
-              <w:left w:w="100" w:type="dxa"/>
-              <w:right w:w="100" w:type="dxa"/>
+              <w:top w:w="70" w:type="dxa"/>
+              <w:bottom w:w="70" w:type="dxa"/>
+              <w:left w:w="90" w:type="dxa"/>
+              <w:right w:w="90" w:type="dxa"/>
             </w:tcMar>
           </w:tcPr>
           <w:p>
@@ -1387,14 +1387,14 @@
         </w:tc>
         <w:tc>
           <w:tcPr>
-            <w:tcW w:type="dxa" w:w="2257"/>
+            <w:tcW w:type="dxa" w:w="2401"/>
             <w:vAlign w:val="center"/>
             <w:shd w:fill="FFFFFF"/>
             <w:tcMar>
-              <w:top w:w="80" w:type="dxa"/>
-              <w:bottom w:w="80" w:type="dxa"/>
-              <w:left w:w="100" w:type="dxa"/>
-              <w:right w:w="100" w:type="dxa"/>
+              <w:top w:w="70" w:type="dxa"/>
+              <w:bottom w:w="70" w:type="dxa"/>
+              <w:left w:w="90" w:type="dxa"/>
+              <w:right w:w="90" w:type="dxa"/>
             </w:tcMar>
           </w:tcPr>
           <w:p>
@@ -1419,14 +1419,14 @@
         </w:trPr>
         <w:tc>
           <w:tcPr>
-            <w:tcW w:type="dxa" w:w="2257"/>
+            <w:tcW w:type="dxa" w:w="2401"/>
             <w:vAlign w:val="center"/>
             <w:shd w:fill="F2F5F9"/>
             <w:tcMar>
-              <w:top w:w="80" w:type="dxa"/>
-              <w:bottom w:w="80" w:type="dxa"/>
-              <w:left w:w="100" w:type="dxa"/>
-              <w:right w:w="100" w:type="dxa"/>
+              <w:top w:w="70" w:type="dxa"/>
+              <w:bottom w:w="70" w:type="dxa"/>
+              <w:left w:w="90" w:type="dxa"/>
+              <w:right w:w="90" w:type="dxa"/>
             </w:tcMar>
           </w:tcPr>
           <w:p>
@@ -1447,14 +1447,14 @@
         </w:tc>
         <w:tc>
           <w:tcPr>
-            <w:tcW w:type="dxa" w:w="2257"/>
+            <w:tcW w:type="dxa" w:w="2401"/>
             <w:vAlign w:val="center"/>
             <w:shd w:fill="F2F5F9"/>
             <w:tcMar>
-              <w:top w:w="80" w:type="dxa"/>
-              <w:bottom w:w="80" w:type="dxa"/>
-              <w:left w:w="100" w:type="dxa"/>
-              <w:right w:w="100" w:type="dxa"/>
+              <w:top w:w="70" w:type="dxa"/>
+              <w:bottom w:w="70" w:type="dxa"/>
+              <w:left w:w="90" w:type="dxa"/>
+              <w:right w:w="90" w:type="dxa"/>
             </w:tcMar>
           </w:tcPr>
           <w:p>
@@ -1474,14 +1474,14 @@
         </w:tc>
         <w:tc>
           <w:tcPr>
-            <w:tcW w:type="dxa" w:w="2257"/>
+            <w:tcW w:type="dxa" w:w="2401"/>
             <w:vAlign w:val="center"/>
             <w:shd w:fill="F2F5F9"/>
             <w:tcMar>
-              <w:top w:w="80" w:type="dxa"/>
-              <w:bottom w:w="80" w:type="dxa"/>
-              <w:left w:w="100" w:type="dxa"/>
-              <w:right w:w="100" w:type="dxa"/>
+              <w:top w:w="70" w:type="dxa"/>
+              <w:bottom w:w="70" w:type="dxa"/>
+              <w:left w:w="90" w:type="dxa"/>
+              <w:right w:w="90" w:type="dxa"/>
             </w:tcMar>
           </w:tcPr>
           <w:p>
@@ -1501,14 +1501,14 @@
         </w:tc>
         <w:tc>
           <w:tcPr>
-            <w:tcW w:type="dxa" w:w="2257"/>
+            <w:tcW w:type="dxa" w:w="2401"/>
             <w:vAlign w:val="center"/>
             <w:shd w:fill="F2F5F9"/>
             <w:tcMar>
-              <w:top w:w="80" w:type="dxa"/>
-              <w:bottom w:w="80" w:type="dxa"/>
-              <w:left w:w="100" w:type="dxa"/>
-              <w:right w:w="100" w:type="dxa"/>
+              <w:top w:w="70" w:type="dxa"/>
+              <w:bottom w:w="70" w:type="dxa"/>
+              <w:left w:w="90" w:type="dxa"/>
+              <w:right w:w="90" w:type="dxa"/>
             </w:tcMar>
           </w:tcPr>
           <w:p>
@@ -1533,14 +1533,14 @@
         </w:trPr>
         <w:tc>
           <w:tcPr>
-            <w:tcW w:type="dxa" w:w="2257"/>
+            <w:tcW w:type="dxa" w:w="2401"/>
             <w:vAlign w:val="center"/>
             <w:shd w:fill="FFFFFF"/>
             <w:tcMar>
-              <w:top w:w="80" w:type="dxa"/>
-              <w:bottom w:w="80" w:type="dxa"/>
-              <w:left w:w="100" w:type="dxa"/>
-              <w:right w:w="100" w:type="dxa"/>
+              <w:top w:w="70" w:type="dxa"/>
+              <w:bottom w:w="70" w:type="dxa"/>
+              <w:left w:w="90" w:type="dxa"/>
+              <w:right w:w="90" w:type="dxa"/>
             </w:tcMar>
           </w:tcPr>
           <w:p>
@@ -1561,14 +1561,14 @@
         </w:tc>
         <w:tc>
           <w:tcPr>
-            <w:tcW w:type="dxa" w:w="2257"/>
+            <w:tcW w:type="dxa" w:w="2401"/>
             <w:vAlign w:val="center"/>
             <w:shd w:fill="FFFFFF"/>
             <w:tcMar>
-              <w:top w:w="80" w:type="dxa"/>
-              <w:bottom w:w="80" w:type="dxa"/>
-              <w:left w:w="100" w:type="dxa"/>
-              <w:right w:w="100" w:type="dxa"/>
+              <w:top w:w="70" w:type="dxa"/>
+              <w:bottom w:w="70" w:type="dxa"/>
+              <w:left w:w="90" w:type="dxa"/>
+              <w:right w:w="90" w:type="dxa"/>
             </w:tcMar>
           </w:tcPr>
           <w:p>
@@ -1588,14 +1588,14 @@
         </w:tc>
         <w:tc>
           <w:tcPr>
-            <w:tcW w:type="dxa" w:w="2257"/>
+            <w:tcW w:type="dxa" w:w="2401"/>
             <w:vAlign w:val="center"/>
             <w:shd w:fill="FFFFFF"/>
             <w:tcMar>
-              <w:top w:w="80" w:type="dxa"/>
-              <w:bottom w:w="80" w:type="dxa"/>
-              <w:left w:w="100" w:type="dxa"/>
-              <w:right w:w="100" w:type="dxa"/>
+              <w:top w:w="70" w:type="dxa"/>
+              <w:bottom w:w="70" w:type="dxa"/>
+              <w:left w:w="90" w:type="dxa"/>
+              <w:right w:w="90" w:type="dxa"/>
             </w:tcMar>
           </w:tcPr>
           <w:p>
@@ -1615,14 +1615,14 @@
         </w:tc>
         <w:tc>
           <w:tcPr>
-            <w:tcW w:type="dxa" w:w="2257"/>
+            <w:tcW w:type="dxa" w:w="2401"/>
             <w:vAlign w:val="center"/>
             <w:shd w:fill="FFFFFF"/>
             <w:tcMar>
-              <w:top w:w="80" w:type="dxa"/>
-              <w:bottom w:w="80" w:type="dxa"/>
-              <w:left w:w="100" w:type="dxa"/>
-              <w:right w:w="100" w:type="dxa"/>
+              <w:top w:w="70" w:type="dxa"/>
+              <w:bottom w:w="70" w:type="dxa"/>
+              <w:left w:w="90" w:type="dxa"/>
+              <w:right w:w="90" w:type="dxa"/>
             </w:tcMar>
           </w:tcPr>
           <w:p>
@@ -1647,14 +1647,14 @@
         </w:trPr>
         <w:tc>
           <w:tcPr>
-            <w:tcW w:type="dxa" w:w="2257"/>
+            <w:tcW w:type="dxa" w:w="2401"/>
             <w:vAlign w:val="center"/>
             <w:shd w:fill="F2F5F9"/>
             <w:tcMar>
-              <w:top w:w="80" w:type="dxa"/>
-              <w:bottom w:w="80" w:type="dxa"/>
-              <w:left w:w="100" w:type="dxa"/>
-              <w:right w:w="100" w:type="dxa"/>
+              <w:top w:w="70" w:type="dxa"/>
+              <w:bottom w:w="70" w:type="dxa"/>
+              <w:left w:w="90" w:type="dxa"/>
+              <w:right w:w="90" w:type="dxa"/>
             </w:tcMar>
           </w:tcPr>
           <w:p>
@@ -1675,14 +1675,14 @@
         </w:tc>
         <w:tc>
           <w:tcPr>
-            <w:tcW w:type="dxa" w:w="2257"/>
+            <w:tcW w:type="dxa" w:w="2401"/>
             <w:vAlign w:val="center"/>
             <w:shd w:fill="F2F5F9"/>
             <w:tcMar>
-              <w:top w:w="80" w:type="dxa"/>
-              <w:bottom w:w="80" w:type="dxa"/>
-              <w:left w:w="100" w:type="dxa"/>
-              <w:right w:w="100" w:type="dxa"/>
+              <w:top w:w="70" w:type="dxa"/>
+              <w:bottom w:w="70" w:type="dxa"/>
+              <w:left w:w="90" w:type="dxa"/>
+              <w:right w:w="90" w:type="dxa"/>
             </w:tcMar>
           </w:tcPr>
           <w:p>
@@ -1703,14 +1703,14 @@
         </w:tc>
         <w:tc>
           <w:tcPr>
-            <w:tcW w:type="dxa" w:w="2257"/>
+            <w:tcW w:type="dxa" w:w="2401"/>
             <w:vAlign w:val="center"/>
             <w:shd w:fill="F2F5F9"/>
             <w:tcMar>
-              <w:top w:w="80" w:type="dxa"/>
-              <w:bottom w:w="80" w:type="dxa"/>
-              <w:left w:w="100" w:type="dxa"/>
-              <w:right w:w="100" w:type="dxa"/>
+              <w:top w:w="70" w:type="dxa"/>
+              <w:bottom w:w="70" w:type="dxa"/>
+              <w:left w:w="90" w:type="dxa"/>
+              <w:right w:w="90" w:type="dxa"/>
             </w:tcMar>
           </w:tcPr>
           <w:p>
@@ -1730,14 +1730,14 @@
         </w:tc>
         <w:tc>
           <w:tcPr>
-            <w:tcW w:type="dxa" w:w="2257"/>
+            <w:tcW w:type="dxa" w:w="2401"/>
             <w:vAlign w:val="center"/>
             <w:shd w:fill="F2F5F9"/>
             <w:tcMar>
-              <w:top w:w="80" w:type="dxa"/>
-              <w:bottom w:w="80" w:type="dxa"/>
-              <w:left w:w="100" w:type="dxa"/>
-              <w:right w:w="100" w:type="dxa"/>
+              <w:top w:w="70" w:type="dxa"/>
+              <w:bottom w:w="70" w:type="dxa"/>
+              <w:left w:w="90" w:type="dxa"/>
+              <w:right w:w="90" w:type="dxa"/>
             </w:tcMar>
           </w:tcPr>
           <w:p>
@@ -1762,14 +1762,14 @@
         </w:trPr>
         <w:tc>
           <w:tcPr>
-            <w:tcW w:type="dxa" w:w="2257"/>
+            <w:tcW w:type="dxa" w:w="2401"/>
             <w:vAlign w:val="center"/>
             <w:shd w:fill="FFFFFF"/>
             <w:tcMar>
-              <w:top w:w="80" w:type="dxa"/>
-              <w:bottom w:w="80" w:type="dxa"/>
-              <w:left w:w="100" w:type="dxa"/>
-              <w:right w:w="100" w:type="dxa"/>
+              <w:top w:w="70" w:type="dxa"/>
+              <w:bottom w:w="70" w:type="dxa"/>
+              <w:left w:w="90" w:type="dxa"/>
+              <w:right w:w="90" w:type="dxa"/>
             </w:tcMar>
           </w:tcPr>
           <w:p>
@@ -1790,14 +1790,14 @@
         </w:tc>
         <w:tc>
           <w:tcPr>
-            <w:tcW w:type="dxa" w:w="2257"/>
+            <w:tcW w:type="dxa" w:w="2401"/>
             <w:vAlign w:val="center"/>
             <w:shd w:fill="FFFFFF"/>
             <w:tcMar>
-              <w:top w:w="80" w:type="dxa"/>
-              <w:bottom w:w="80" w:type="dxa"/>
-              <w:left w:w="100" w:type="dxa"/>
-              <w:right w:w="100" w:type="dxa"/>
+              <w:top w:w="70" w:type="dxa"/>
+              <w:bottom w:w="70" w:type="dxa"/>
+              <w:left w:w="90" w:type="dxa"/>
+              <w:right w:w="90" w:type="dxa"/>
             </w:tcMar>
           </w:tcPr>
           <w:p>
@@ -1817,14 +1817,14 @@
         </w:tc>
         <w:tc>
           <w:tcPr>
-            <w:tcW w:type="dxa" w:w="2257"/>
+            <w:tcW w:type="dxa" w:w="2401"/>
             <w:vAlign w:val="center"/>
             <w:shd w:fill="FFFFFF"/>
             <w:tcMar>
-              <w:top w:w="80" w:type="dxa"/>
-              <w:bottom w:w="80" w:type="dxa"/>
-              <w:left w:w="100" w:type="dxa"/>
-              <w:right w:w="100" w:type="dxa"/>
+              <w:top w:w="70" w:type="dxa"/>
+              <w:bottom w:w="70" w:type="dxa"/>
+              <w:left w:w="90" w:type="dxa"/>
+              <w:right w:w="90" w:type="dxa"/>
             </w:tcMar>
           </w:tcPr>
           <w:p>
@@ -1844,14 +1844,14 @@
         </w:tc>
         <w:tc>
           <w:tcPr>
-            <w:tcW w:type="dxa" w:w="2257"/>
+            <w:tcW w:type="dxa" w:w="2401"/>
             <w:vAlign w:val="center"/>
             <w:shd w:fill="FFFFFF"/>
             <w:tcMar>
-              <w:top w:w="80" w:type="dxa"/>
-              <w:bottom w:w="80" w:type="dxa"/>
-              <w:left w:w="100" w:type="dxa"/>
-              <w:right w:w="100" w:type="dxa"/>
+              <w:top w:w="70" w:type="dxa"/>
+              <w:bottom w:w="70" w:type="dxa"/>
+              <w:left w:w="90" w:type="dxa"/>
+              <w:right w:w="90" w:type="dxa"/>
             </w:tcMar>
           </w:tcPr>
           <w:p>
@@ -1876,14 +1876,14 @@
         </w:trPr>
         <w:tc>
           <w:tcPr>
-            <w:tcW w:type="dxa" w:w="2257"/>
+            <w:tcW w:type="dxa" w:w="2401"/>
             <w:vAlign w:val="center"/>
             <w:shd w:fill="F2F5F9"/>
             <w:tcMar>
-              <w:top w:w="80" w:type="dxa"/>
-              <w:bottom w:w="80" w:type="dxa"/>
-              <w:left w:w="100" w:type="dxa"/>
-              <w:right w:w="100" w:type="dxa"/>
+              <w:top w:w="70" w:type="dxa"/>
+              <w:bottom w:w="70" w:type="dxa"/>
+              <w:left w:w="90" w:type="dxa"/>
+              <w:right w:w="90" w:type="dxa"/>
             </w:tcMar>
           </w:tcPr>
           <w:p>
@@ -1904,14 +1904,14 @@
         </w:tc>
         <w:tc>
           <w:tcPr>
-            <w:tcW w:type="dxa" w:w="2257"/>
+            <w:tcW w:type="dxa" w:w="2401"/>
             <w:vAlign w:val="center"/>
             <w:shd w:fill="F2F5F9"/>
             <w:tcMar>
-              <w:top w:w="80" w:type="dxa"/>
-              <w:bottom w:w="80" w:type="dxa"/>
-              <w:left w:w="100" w:type="dxa"/>
-              <w:right w:w="100" w:type="dxa"/>
+              <w:top w:w="70" w:type="dxa"/>
+              <w:bottom w:w="70" w:type="dxa"/>
+              <w:left w:w="90" w:type="dxa"/>
+              <w:right w:w="90" w:type="dxa"/>
             </w:tcMar>
           </w:tcPr>
           <w:p>
@@ -1932,14 +1932,14 @@
         </w:tc>
         <w:tc>
           <w:tcPr>
-            <w:tcW w:type="dxa" w:w="2257"/>
+            <w:tcW w:type="dxa" w:w="2401"/>
             <w:vAlign w:val="center"/>
             <w:shd w:fill="F2F5F9"/>
             <w:tcMar>
-              <w:top w:w="80" w:type="dxa"/>
-              <w:bottom w:w="80" w:type="dxa"/>
-              <w:left w:w="100" w:type="dxa"/>
-              <w:right w:w="100" w:type="dxa"/>
+              <w:top w:w="70" w:type="dxa"/>
+              <w:bottom w:w="70" w:type="dxa"/>
+              <w:left w:w="90" w:type="dxa"/>
+              <w:right w:w="90" w:type="dxa"/>
             </w:tcMar>
           </w:tcPr>
           <w:p>
@@ -1959,14 +1959,14 @@
         </w:tc>
         <w:tc>
           <w:tcPr>
-            <w:tcW w:type="dxa" w:w="2257"/>
+            <w:tcW w:type="dxa" w:w="2401"/>
             <w:vAlign w:val="center"/>
             <w:shd w:fill="F2F5F9"/>
             <w:tcMar>
-              <w:top w:w="80" w:type="dxa"/>
-              <w:bottom w:w="80" w:type="dxa"/>
-              <w:left w:w="100" w:type="dxa"/>
-              <w:right w:w="100" w:type="dxa"/>
+              <w:top w:w="70" w:type="dxa"/>
+              <w:bottom w:w="70" w:type="dxa"/>
+              <w:left w:w="90" w:type="dxa"/>
+              <w:right w:w="90" w:type="dxa"/>
             </w:tcMar>
           </w:tcPr>
           <w:p>
@@ -1991,14 +1991,14 @@
         </w:trPr>
         <w:tc>
           <w:tcPr>
-            <w:tcW w:type="dxa" w:w="2257"/>
+            <w:tcW w:type="dxa" w:w="2401"/>
             <w:vAlign w:val="center"/>
             <w:shd w:fill="FFFFFF"/>
             <w:tcMar>
-              <w:top w:w="80" w:type="dxa"/>
-              <w:bottom w:w="80" w:type="dxa"/>
-              <w:left w:w="100" w:type="dxa"/>
-              <w:right w:w="100" w:type="dxa"/>
+              <w:top w:w="70" w:type="dxa"/>
+              <w:bottom w:w="70" w:type="dxa"/>
+              <w:left w:w="90" w:type="dxa"/>
+              <w:right w:w="90" w:type="dxa"/>
             </w:tcMar>
           </w:tcPr>
           <w:p>
@@ -2019,14 +2019,14 @@
         </w:tc>
         <w:tc>
           <w:tcPr>
-            <w:tcW w:type="dxa" w:w="2257"/>
+            <w:tcW w:type="dxa" w:w="2401"/>
             <w:vAlign w:val="center"/>
             <w:shd w:fill="FFFFFF"/>
             <w:tcMar>
-              <w:top w:w="80" w:type="dxa"/>
-              <w:bottom w:w="80" w:type="dxa"/>
-              <w:left w:w="100" w:type="dxa"/>
-              <w:right w:w="100" w:type="dxa"/>
+              <w:top w:w="70" w:type="dxa"/>
+              <w:bottom w:w="70" w:type="dxa"/>
+              <w:left w:w="90" w:type="dxa"/>
+              <w:right w:w="90" w:type="dxa"/>
             </w:tcMar>
           </w:tcPr>
           <w:p>
@@ -2046,14 +2046,14 @@
         </w:tc>
         <w:tc>
           <w:tcPr>
-            <w:tcW w:type="dxa" w:w="2257"/>
+            <w:tcW w:type="dxa" w:w="2401"/>
             <w:vAlign w:val="center"/>
             <w:shd w:fill="FFFFFF"/>
             <w:tcMar>
-              <w:top w:w="80" w:type="dxa"/>
-              <w:bottom w:w="80" w:type="dxa"/>
-              <w:left w:w="100" w:type="dxa"/>
-              <w:right w:w="100" w:type="dxa"/>
+              <w:top w:w="70" w:type="dxa"/>
+              <w:bottom w:w="70" w:type="dxa"/>
+              <w:left w:w="90" w:type="dxa"/>
+              <w:right w:w="90" w:type="dxa"/>
             </w:tcMar>
           </w:tcPr>
           <w:p>
@@ -2073,14 +2073,14 @@
         </w:tc>
         <w:tc>
           <w:tcPr>
-            <w:tcW w:type="dxa" w:w="2257"/>
+            <w:tcW w:type="dxa" w:w="2401"/>
             <w:vAlign w:val="center"/>
             <w:shd w:fill="FFFFFF"/>
             <w:tcMar>
-              <w:top w:w="80" w:type="dxa"/>
-              <w:bottom w:w="80" w:type="dxa"/>
-              <w:left w:w="100" w:type="dxa"/>
-              <w:right w:w="100" w:type="dxa"/>
+              <w:top w:w="70" w:type="dxa"/>
+              <w:bottom w:w="70" w:type="dxa"/>
+              <w:left w:w="90" w:type="dxa"/>
+              <w:right w:w="90" w:type="dxa"/>
             </w:tcMar>
           </w:tcPr>
           <w:p>
@@ -2105,14 +2105,14 @@
         </w:trPr>
         <w:tc>
           <w:tcPr>
-            <w:tcW w:type="dxa" w:w="2257"/>
+            <w:tcW w:type="dxa" w:w="2401"/>
             <w:vAlign w:val="center"/>
             <w:shd w:fill="F2F5F9"/>
             <w:tcMar>
-              <w:top w:w="80" w:type="dxa"/>
-              <w:bottom w:w="80" w:type="dxa"/>
-              <w:left w:w="100" w:type="dxa"/>
-              <w:right w:w="100" w:type="dxa"/>
+              <w:top w:w="70" w:type="dxa"/>
+              <w:bottom w:w="70" w:type="dxa"/>
+              <w:left w:w="90" w:type="dxa"/>
+              <w:right w:w="90" w:type="dxa"/>
             </w:tcMar>
           </w:tcPr>
           <w:p>
@@ -2133,14 +2133,14 @@
         </w:tc>
         <w:tc>
           <w:tcPr>
-            <w:tcW w:type="dxa" w:w="2257"/>
+            <w:tcW w:type="dxa" w:w="2401"/>
             <w:vAlign w:val="center"/>
             <w:shd w:fill="F2F5F9"/>
             <w:tcMar>
-              <w:top w:w="80" w:type="dxa"/>
-              <w:bottom w:w="80" w:type="dxa"/>
-              <w:left w:w="100" w:type="dxa"/>
-              <w:right w:w="100" w:type="dxa"/>
+              <w:top w:w="70" w:type="dxa"/>
+              <w:bottom w:w="70" w:type="dxa"/>
+              <w:left w:w="90" w:type="dxa"/>
+              <w:right w:w="90" w:type="dxa"/>
             </w:tcMar>
           </w:tcPr>
           <w:p>
@@ -2160,14 +2160,14 @@
         </w:tc>
         <w:tc>
           <w:tcPr>
-            <w:tcW w:type="dxa" w:w="2257"/>
+            <w:tcW w:type="dxa" w:w="2401"/>
             <w:vAlign w:val="center"/>
             <w:shd w:fill="F2F5F9"/>
             <w:tcMar>
-              <w:top w:w="80" w:type="dxa"/>
-              <w:bottom w:w="80" w:type="dxa"/>
-              <w:left w:w="100" w:type="dxa"/>
-              <w:right w:w="100" w:type="dxa"/>
+              <w:top w:w="70" w:type="dxa"/>
+              <w:bottom w:w="70" w:type="dxa"/>
+              <w:left w:w="90" w:type="dxa"/>
+              <w:right w:w="90" w:type="dxa"/>
             </w:tcMar>
           </w:tcPr>
           <w:p>
@@ -2187,14 +2187,14 @@
         </w:tc>
         <w:tc>
           <w:tcPr>
-            <w:tcW w:type="dxa" w:w="2257"/>
+            <w:tcW w:type="dxa" w:w="2401"/>
             <w:vAlign w:val="center"/>
             <w:shd w:fill="F2F5F9"/>
             <w:tcMar>
-              <w:top w:w="80" w:type="dxa"/>
-              <w:bottom w:w="80" w:type="dxa"/>
-              <w:left w:w="100" w:type="dxa"/>
-              <w:right w:w="100" w:type="dxa"/>
+              <w:top w:w="70" w:type="dxa"/>
+              <w:bottom w:w="70" w:type="dxa"/>
+              <w:left w:w="90" w:type="dxa"/>
+              <w:right w:w="90" w:type="dxa"/>
             </w:tcMar>
           </w:tcPr>
           <w:p>
@@ -2219,14 +2219,14 @@
         </w:trPr>
         <w:tc>
           <w:tcPr>
-            <w:tcW w:type="dxa" w:w="2257"/>
+            <w:tcW w:type="dxa" w:w="2401"/>
             <w:vAlign w:val="center"/>
             <w:shd w:fill="FFFFFF"/>
             <w:tcMar>
-              <w:top w:w="80" w:type="dxa"/>
-              <w:bottom w:w="80" w:type="dxa"/>
-              <w:left w:w="100" w:type="dxa"/>
-              <w:right w:w="100" w:type="dxa"/>
+              <w:top w:w="70" w:type="dxa"/>
+              <w:bottom w:w="70" w:type="dxa"/>
+              <w:left w:w="90" w:type="dxa"/>
+              <w:right w:w="90" w:type="dxa"/>
             </w:tcMar>
           </w:tcPr>
           <w:p>
@@ -2247,14 +2247,14 @@
         </w:tc>
         <w:tc>
           <w:tcPr>
-            <w:tcW w:type="dxa" w:w="2257"/>
+            <w:tcW w:type="dxa" w:w="2401"/>
             <w:vAlign w:val="center"/>
             <w:shd w:fill="FFFFFF"/>
             <w:tcMar>
-              <w:top w:w="80" w:type="dxa"/>
-              <w:bottom w:w="80" w:type="dxa"/>
-              <w:left w:w="100" w:type="dxa"/>
-              <w:right w:w="100" w:type="dxa"/>
+              <w:top w:w="70" w:type="dxa"/>
+              <w:bottom w:w="70" w:type="dxa"/>
+              <w:left w:w="90" w:type="dxa"/>
+              <w:right w:w="90" w:type="dxa"/>
             </w:tcMar>
           </w:tcPr>
           <w:p>
@@ -2275,14 +2275,14 @@
         </w:tc>
         <w:tc>
           <w:tcPr>
-            <w:tcW w:type="dxa" w:w="2257"/>
+            <w:tcW w:type="dxa" w:w="2401"/>
             <w:vAlign w:val="center"/>
             <w:shd w:fill="FFFFFF"/>
             <w:tcMar>
-              <w:top w:w="80" w:type="dxa"/>
-              <w:bottom w:w="80" w:type="dxa"/>
-              <w:left w:w="100" w:type="dxa"/>
-              <w:right w:w="100" w:type="dxa"/>
+              <w:top w:w="70" w:type="dxa"/>
+              <w:bottom w:w="70" w:type="dxa"/>
+              <w:left w:w="90" w:type="dxa"/>
+              <w:right w:w="90" w:type="dxa"/>
             </w:tcMar>
           </w:tcPr>
           <w:p>
@@ -2303,14 +2303,14 @@
         </w:tc>
         <w:tc>
           <w:tcPr>
-            <w:tcW w:type="dxa" w:w="2257"/>
+            <w:tcW w:type="dxa" w:w="2401"/>
             <w:vAlign w:val="center"/>
             <w:shd w:fill="FFFFFF"/>
             <w:tcMar>
-              <w:top w:w="80" w:type="dxa"/>
-              <w:bottom w:w="80" w:type="dxa"/>
-              <w:left w:w="100" w:type="dxa"/>
-              <w:right w:w="100" w:type="dxa"/>
+              <w:top w:w="70" w:type="dxa"/>
+              <w:bottom w:w="70" w:type="dxa"/>
+              <w:left w:w="90" w:type="dxa"/>
+              <w:right w:w="90" w:type="dxa"/>
             </w:tcMar>
           </w:tcPr>
           <w:p>
@@ -2341,7 +2341,7 @@
     </w:tbl>
     <w:p>
       <w:pPr>
-        <w:spacing w:after="120"/>
+        <w:spacing w:after="100"/>
       </w:pPr>
     </w:p>
     <w:p>
@@ -2424,9 +2424,9 @@
       <w:r>
         <w:rPr>
           <w:color w:val="C8D2E1"/>
-          <w:sz w:val="16"/>
+          <w:sz w:val="14"/>
         </w:rPr>
-        <w:t>_________________________________________________________________________________</w:t>
+        <w:t>———————————————————————————————————————————————————————————————————————————</w:t>
       </w:r>
     </w:p>
     <w:p>
@@ -3124,9 +3124,9 @@
       <w:r>
         <w:rPr>
           <w:color w:val="C8D2E1"/>
-          <w:sz w:val="16"/>
+          <w:sz w:val="14"/>
         </w:rPr>
-        <w:t>_________________________________________________________________________________</w:t>
+        <w:t>———————————————————————————————————————————————————————————————————————————</w:t>
       </w:r>
     </w:p>
     <w:p>
@@ -3175,9 +3175,9 @@
         </w:tblBorders>
       </w:tblPr>
       <w:tblGrid>
-        <w:gridCol w:w="3010"/>
-        <w:gridCol w:w="3010"/>
-        <w:gridCol w:w="3010"/>
+        <w:gridCol w:w="3202"/>
+        <w:gridCol w:w="3202"/>
+        <w:gridCol w:w="3202"/>
       </w:tblGrid>
       <w:tr>
         <w:trPr>
@@ -3187,7 +3187,7 @@
         </w:trPr>
         <w:tc>
           <w:tcPr>
-            <w:tcW w:type="dxa" w:w="3010"/>
+            <w:tcW w:type="dxa" w:w="3202"/>
             <w:vAlign w:val="center"/>
             <w:shd w:fill="1F3864"/>
             <w:tcMar>
@@ -3215,7 +3215,7 @@
         </w:tc>
         <w:tc>
           <w:tcPr>
-            <w:tcW w:type="dxa" w:w="3010"/>
+            <w:tcW w:type="dxa" w:w="3202"/>
             <w:vAlign w:val="center"/>
             <w:shd w:fill="1F3864"/>
             <w:tcMar>
@@ -3243,7 +3243,7 @@
         </w:tc>
         <w:tc>
           <w:tcPr>
-            <w:tcW w:type="dxa" w:w="3010"/>
+            <w:tcW w:type="dxa" w:w="3202"/>
             <w:vAlign w:val="center"/>
             <w:shd w:fill="1F3864"/>
             <w:tcMar>
@@ -3276,14 +3276,14 @@
         </w:trPr>
         <w:tc>
           <w:tcPr>
-            <w:tcW w:type="dxa" w:w="3010"/>
+            <w:tcW w:type="dxa" w:w="3202"/>
             <w:vAlign w:val="center"/>
             <w:shd w:fill="FFFFFF"/>
             <w:tcMar>
-              <w:top w:w="80" w:type="dxa"/>
-              <w:bottom w:w="80" w:type="dxa"/>
-              <w:left w:w="100" w:type="dxa"/>
-              <w:right w:w="100" w:type="dxa"/>
+              <w:top w:w="70" w:type="dxa"/>
+              <w:bottom w:w="70" w:type="dxa"/>
+              <w:left w:w="90" w:type="dxa"/>
+              <w:right w:w="90" w:type="dxa"/>
             </w:tcMar>
           </w:tcPr>
           <w:p>
@@ -3303,14 +3303,14 @@
         </w:tc>
         <w:tc>
           <w:tcPr>
-            <w:tcW w:type="dxa" w:w="3010"/>
+            <w:tcW w:type="dxa" w:w="3202"/>
             <w:vAlign w:val="center"/>
             <w:shd w:fill="FFFFFF"/>
             <w:tcMar>
-              <w:top w:w="80" w:type="dxa"/>
-              <w:bottom w:w="80" w:type="dxa"/>
-              <w:left w:w="100" w:type="dxa"/>
-              <w:right w:w="100" w:type="dxa"/>
+              <w:top w:w="70" w:type="dxa"/>
+              <w:bottom w:w="70" w:type="dxa"/>
+              <w:left w:w="90" w:type="dxa"/>
+              <w:right w:w="90" w:type="dxa"/>
             </w:tcMar>
           </w:tcPr>
           <w:p>
@@ -3330,14 +3330,14 @@
         </w:tc>
         <w:tc>
           <w:tcPr>
-            <w:tcW w:type="dxa" w:w="3010"/>
+            <w:tcW w:type="dxa" w:w="3202"/>
             <w:vAlign w:val="center"/>
             <w:shd w:fill="FFFFFF"/>
             <w:tcMar>
-              <w:top w:w="80" w:type="dxa"/>
-              <w:bottom w:w="80" w:type="dxa"/>
-              <w:left w:w="100" w:type="dxa"/>
-              <w:right w:w="100" w:type="dxa"/>
+              <w:top w:w="70" w:type="dxa"/>
+              <w:bottom w:w="70" w:type="dxa"/>
+              <w:left w:w="90" w:type="dxa"/>
+              <w:right w:w="90" w:type="dxa"/>
             </w:tcMar>
           </w:tcPr>
           <w:p>
@@ -3362,14 +3362,14 @@
         </w:trPr>
         <w:tc>
           <w:tcPr>
-            <w:tcW w:type="dxa" w:w="3010"/>
+            <w:tcW w:type="dxa" w:w="3202"/>
             <w:vAlign w:val="center"/>
             <w:shd w:fill="F2F5F9"/>
             <w:tcMar>
-              <w:top w:w="80" w:type="dxa"/>
-              <w:bottom w:w="80" w:type="dxa"/>
-              <w:left w:w="100" w:type="dxa"/>
-              <w:right w:w="100" w:type="dxa"/>
+              <w:top w:w="70" w:type="dxa"/>
+              <w:bottom w:w="70" w:type="dxa"/>
+              <w:left w:w="90" w:type="dxa"/>
+              <w:right w:w="90" w:type="dxa"/>
             </w:tcMar>
           </w:tcPr>
           <w:p>
@@ -3389,14 +3389,14 @@
         </w:tc>
         <w:tc>
           <w:tcPr>
-            <w:tcW w:type="dxa" w:w="3010"/>
+            <w:tcW w:type="dxa" w:w="3202"/>
             <w:vAlign w:val="center"/>
             <w:shd w:fill="F2F5F9"/>
             <w:tcMar>
-              <w:top w:w="80" w:type="dxa"/>
-              <w:bottom w:w="80" w:type="dxa"/>
-              <w:left w:w="100" w:type="dxa"/>
-              <w:right w:w="100" w:type="dxa"/>
+              <w:top w:w="70" w:type="dxa"/>
+              <w:bottom w:w="70" w:type="dxa"/>
+              <w:left w:w="90" w:type="dxa"/>
+              <w:right w:w="90" w:type="dxa"/>
             </w:tcMar>
           </w:tcPr>
           <w:p>
@@ -3416,14 +3416,14 @@
         </w:tc>
         <w:tc>
           <w:tcPr>
-            <w:tcW w:type="dxa" w:w="3010"/>
+            <w:tcW w:type="dxa" w:w="3202"/>
             <w:vAlign w:val="center"/>
             <w:shd w:fill="F2F5F9"/>
             <w:tcMar>
-              <w:top w:w="80" w:type="dxa"/>
-              <w:bottom w:w="80" w:type="dxa"/>
-              <w:left w:w="100" w:type="dxa"/>
-              <w:right w:w="100" w:type="dxa"/>
+              <w:top w:w="70" w:type="dxa"/>
+              <w:bottom w:w="70" w:type="dxa"/>
+              <w:left w:w="90" w:type="dxa"/>
+              <w:right w:w="90" w:type="dxa"/>
             </w:tcMar>
           </w:tcPr>
           <w:p>
@@ -3448,14 +3448,14 @@
         </w:trPr>
         <w:tc>
           <w:tcPr>
-            <w:tcW w:type="dxa" w:w="3010"/>
+            <w:tcW w:type="dxa" w:w="3202"/>
             <w:vAlign w:val="center"/>
             <w:shd w:fill="FFFFFF"/>
             <w:tcMar>
-              <w:top w:w="80" w:type="dxa"/>
-              <w:bottom w:w="80" w:type="dxa"/>
-              <w:left w:w="100" w:type="dxa"/>
-              <w:right w:w="100" w:type="dxa"/>
+              <w:top w:w="70" w:type="dxa"/>
+              <w:bottom w:w="70" w:type="dxa"/>
+              <w:left w:w="90" w:type="dxa"/>
+              <w:right w:w="90" w:type="dxa"/>
             </w:tcMar>
           </w:tcPr>
           <w:p>
@@ -3475,14 +3475,14 @@
         </w:tc>
         <w:tc>
           <w:tcPr>
-            <w:tcW w:type="dxa" w:w="3010"/>
+            <w:tcW w:type="dxa" w:w="3202"/>
             <w:vAlign w:val="center"/>
             <w:shd w:fill="FFFFFF"/>
             <w:tcMar>
-              <w:top w:w="80" w:type="dxa"/>
-              <w:bottom w:w="80" w:type="dxa"/>
-              <w:left w:w="100" w:type="dxa"/>
-              <w:right w:w="100" w:type="dxa"/>
+              <w:top w:w="70" w:type="dxa"/>
+              <w:bottom w:w="70" w:type="dxa"/>
+              <w:left w:w="90" w:type="dxa"/>
+              <w:right w:w="90" w:type="dxa"/>
             </w:tcMar>
           </w:tcPr>
           <w:p>
@@ -3502,14 +3502,14 @@
         </w:tc>
         <w:tc>
           <w:tcPr>
-            <w:tcW w:type="dxa" w:w="3010"/>
+            <w:tcW w:type="dxa" w:w="3202"/>
             <w:vAlign w:val="center"/>
             <w:shd w:fill="FFFFFF"/>
             <w:tcMar>
-              <w:top w:w="80" w:type="dxa"/>
-              <w:bottom w:w="80" w:type="dxa"/>
-              <w:left w:w="100" w:type="dxa"/>
-              <w:right w:w="100" w:type="dxa"/>
+              <w:top w:w="70" w:type="dxa"/>
+              <w:bottom w:w="70" w:type="dxa"/>
+              <w:left w:w="90" w:type="dxa"/>
+              <w:right w:w="90" w:type="dxa"/>
             </w:tcMar>
           </w:tcPr>
           <w:p>
@@ -3534,14 +3534,14 @@
         </w:trPr>
         <w:tc>
           <w:tcPr>
-            <w:tcW w:type="dxa" w:w="3010"/>
+            <w:tcW w:type="dxa" w:w="3202"/>
             <w:vAlign w:val="center"/>
             <w:shd w:fill="F2F5F9"/>
             <w:tcMar>
-              <w:top w:w="80" w:type="dxa"/>
-              <w:bottom w:w="80" w:type="dxa"/>
-              <w:left w:w="100" w:type="dxa"/>
-              <w:right w:w="100" w:type="dxa"/>
+              <w:top w:w="70" w:type="dxa"/>
+              <w:bottom w:w="70" w:type="dxa"/>
+              <w:left w:w="90" w:type="dxa"/>
+              <w:right w:w="90" w:type="dxa"/>
             </w:tcMar>
           </w:tcPr>
           <w:p>
@@ -3561,14 +3561,14 @@
         </w:tc>
         <w:tc>
           <w:tcPr>
-            <w:tcW w:type="dxa" w:w="3010"/>
+            <w:tcW w:type="dxa" w:w="3202"/>
             <w:vAlign w:val="center"/>
             <w:shd w:fill="F2F5F9"/>
             <w:tcMar>
-              <w:top w:w="80" w:type="dxa"/>
-              <w:bottom w:w="80" w:type="dxa"/>
-              <w:left w:w="100" w:type="dxa"/>
-              <w:right w:w="100" w:type="dxa"/>
+              <w:top w:w="70" w:type="dxa"/>
+              <w:bottom w:w="70" w:type="dxa"/>
+              <w:left w:w="90" w:type="dxa"/>
+              <w:right w:w="90" w:type="dxa"/>
             </w:tcMar>
           </w:tcPr>
           <w:p>
@@ -3588,14 +3588,14 @@
         </w:tc>
         <w:tc>
           <w:tcPr>
-            <w:tcW w:type="dxa" w:w="3010"/>
+            <w:tcW w:type="dxa" w:w="3202"/>
             <w:vAlign w:val="center"/>
             <w:shd w:fill="F2F5F9"/>
             <w:tcMar>
-              <w:top w:w="80" w:type="dxa"/>
-              <w:bottom w:w="80" w:type="dxa"/>
-              <w:left w:w="100" w:type="dxa"/>
-              <w:right w:w="100" w:type="dxa"/>
+              <w:top w:w="70" w:type="dxa"/>
+              <w:bottom w:w="70" w:type="dxa"/>
+              <w:left w:w="90" w:type="dxa"/>
+              <w:right w:w="90" w:type="dxa"/>
             </w:tcMar>
           </w:tcPr>
           <w:p>
@@ -3620,14 +3620,14 @@
         </w:trPr>
         <w:tc>
           <w:tcPr>
-            <w:tcW w:type="dxa" w:w="3010"/>
+            <w:tcW w:type="dxa" w:w="3202"/>
             <w:vAlign w:val="center"/>
             <w:shd w:fill="FFFFFF"/>
             <w:tcMar>
-              <w:top w:w="80" w:type="dxa"/>
-              <w:bottom w:w="80" w:type="dxa"/>
-              <w:left w:w="100" w:type="dxa"/>
-              <w:right w:w="100" w:type="dxa"/>
+              <w:top w:w="70" w:type="dxa"/>
+              <w:bottom w:w="70" w:type="dxa"/>
+              <w:left w:w="90" w:type="dxa"/>
+              <w:right w:w="90" w:type="dxa"/>
             </w:tcMar>
           </w:tcPr>
           <w:p>
@@ -3647,14 +3647,14 @@
         </w:tc>
         <w:tc>
           <w:tcPr>
-            <w:tcW w:type="dxa" w:w="3010"/>
+            <w:tcW w:type="dxa" w:w="3202"/>
             <w:vAlign w:val="center"/>
             <w:shd w:fill="FFFFFF"/>
             <w:tcMar>
-              <w:top w:w="80" w:type="dxa"/>
-              <w:bottom w:w="80" w:type="dxa"/>
-              <w:left w:w="100" w:type="dxa"/>
-              <w:right w:w="100" w:type="dxa"/>
+              <w:top w:w="70" w:type="dxa"/>
+              <w:bottom w:w="70" w:type="dxa"/>
+              <w:left w:w="90" w:type="dxa"/>
+              <w:right w:w="90" w:type="dxa"/>
             </w:tcMar>
           </w:tcPr>
           <w:p>
@@ -3674,14 +3674,14 @@
         </w:tc>
         <w:tc>
           <w:tcPr>
-            <w:tcW w:type="dxa" w:w="3010"/>
+            <w:tcW w:type="dxa" w:w="3202"/>
             <w:vAlign w:val="center"/>
             <w:shd w:fill="FFFFFF"/>
             <w:tcMar>
-              <w:top w:w="80" w:type="dxa"/>
-              <w:bottom w:w="80" w:type="dxa"/>
-              <w:left w:w="100" w:type="dxa"/>
-              <w:right w:w="100" w:type="dxa"/>
+              <w:top w:w="70" w:type="dxa"/>
+              <w:bottom w:w="70" w:type="dxa"/>
+              <w:left w:w="90" w:type="dxa"/>
+              <w:right w:w="90" w:type="dxa"/>
             </w:tcMar>
           </w:tcPr>
           <w:p>
@@ -3706,14 +3706,14 @@
         </w:trPr>
         <w:tc>
           <w:tcPr>
-            <w:tcW w:type="dxa" w:w="3010"/>
+            <w:tcW w:type="dxa" w:w="3202"/>
             <w:vAlign w:val="center"/>
             <w:shd w:fill="F2F5F9"/>
             <w:tcMar>
-              <w:top w:w="80" w:type="dxa"/>
-              <w:bottom w:w="80" w:type="dxa"/>
-              <w:left w:w="100" w:type="dxa"/>
-              <w:right w:w="100" w:type="dxa"/>
+              <w:top w:w="70" w:type="dxa"/>
+              <w:bottom w:w="70" w:type="dxa"/>
+              <w:left w:w="90" w:type="dxa"/>
+              <w:right w:w="90" w:type="dxa"/>
             </w:tcMar>
           </w:tcPr>
           <w:p>
@@ -3741,14 +3741,14 @@
         </w:tc>
         <w:tc>
           <w:tcPr>
-            <w:tcW w:type="dxa" w:w="3010"/>
+            <w:tcW w:type="dxa" w:w="3202"/>
             <w:vAlign w:val="center"/>
             <w:shd w:fill="F2F5F9"/>
             <w:tcMar>
-              <w:top w:w="80" w:type="dxa"/>
-              <w:bottom w:w="80" w:type="dxa"/>
-              <w:left w:w="100" w:type="dxa"/>
-              <w:right w:w="100" w:type="dxa"/>
+              <w:top w:w="70" w:type="dxa"/>
+              <w:bottom w:w="70" w:type="dxa"/>
+              <w:left w:w="90" w:type="dxa"/>
+              <w:right w:w="90" w:type="dxa"/>
             </w:tcMar>
           </w:tcPr>
           <w:p>
@@ -3768,14 +3768,14 @@
         </w:tc>
         <w:tc>
           <w:tcPr>
-            <w:tcW w:type="dxa" w:w="3010"/>
+            <w:tcW w:type="dxa" w:w="3202"/>
             <w:vAlign w:val="center"/>
             <w:shd w:fill="F2F5F9"/>
             <w:tcMar>
-              <w:top w:w="80" w:type="dxa"/>
-              <w:bottom w:w="80" w:type="dxa"/>
-              <w:left w:w="100" w:type="dxa"/>
-              <w:right w:w="100" w:type="dxa"/>
+              <w:top w:w="70" w:type="dxa"/>
+              <w:bottom w:w="70" w:type="dxa"/>
+              <w:left w:w="90" w:type="dxa"/>
+              <w:right w:w="90" w:type="dxa"/>
             </w:tcMar>
           </w:tcPr>
           <w:p>
@@ -3800,14 +3800,14 @@
         </w:trPr>
         <w:tc>
           <w:tcPr>
-            <w:tcW w:type="dxa" w:w="3010"/>
+            <w:tcW w:type="dxa" w:w="3202"/>
             <w:vAlign w:val="center"/>
             <w:shd w:fill="FFFFFF"/>
             <w:tcMar>
-              <w:top w:w="80" w:type="dxa"/>
-              <w:bottom w:w="80" w:type="dxa"/>
-              <w:left w:w="100" w:type="dxa"/>
-              <w:right w:w="100" w:type="dxa"/>
+              <w:top w:w="70" w:type="dxa"/>
+              <w:bottom w:w="70" w:type="dxa"/>
+              <w:left w:w="90" w:type="dxa"/>
+              <w:right w:w="90" w:type="dxa"/>
             </w:tcMar>
           </w:tcPr>
           <w:p>
@@ -3835,14 +3835,14 @@
         </w:tc>
         <w:tc>
           <w:tcPr>
-            <w:tcW w:type="dxa" w:w="3010"/>
+            <w:tcW w:type="dxa" w:w="3202"/>
             <w:vAlign w:val="center"/>
             <w:shd w:fill="FFFFFF"/>
             <w:tcMar>
-              <w:top w:w="80" w:type="dxa"/>
-              <w:bottom w:w="80" w:type="dxa"/>
-              <w:left w:w="100" w:type="dxa"/>
-              <w:right w:w="100" w:type="dxa"/>
+              <w:top w:w="70" w:type="dxa"/>
+              <w:bottom w:w="70" w:type="dxa"/>
+              <w:left w:w="90" w:type="dxa"/>
+              <w:right w:w="90" w:type="dxa"/>
             </w:tcMar>
           </w:tcPr>
           <w:p>
@@ -3862,14 +3862,14 @@
         </w:tc>
         <w:tc>
           <w:tcPr>
-            <w:tcW w:type="dxa" w:w="3010"/>
+            <w:tcW w:type="dxa" w:w="3202"/>
             <w:vAlign w:val="center"/>
             <w:shd w:fill="FFFFFF"/>
             <w:tcMar>
-              <w:top w:w="80" w:type="dxa"/>
-              <w:bottom w:w="80" w:type="dxa"/>
-              <w:left w:w="100" w:type="dxa"/>
-              <w:right w:w="100" w:type="dxa"/>
+              <w:top w:w="70" w:type="dxa"/>
+              <w:bottom w:w="70" w:type="dxa"/>
+              <w:left w:w="90" w:type="dxa"/>
+              <w:right w:w="90" w:type="dxa"/>
             </w:tcMar>
           </w:tcPr>
           <w:p>
@@ -3894,14 +3894,14 @@
         </w:trPr>
         <w:tc>
           <w:tcPr>
-            <w:tcW w:type="dxa" w:w="3010"/>
+            <w:tcW w:type="dxa" w:w="3202"/>
             <w:vAlign w:val="center"/>
             <w:shd w:fill="F2F5F9"/>
             <w:tcMar>
-              <w:top w:w="80" w:type="dxa"/>
-              <w:bottom w:w="80" w:type="dxa"/>
-              <w:left w:w="100" w:type="dxa"/>
-              <w:right w:w="100" w:type="dxa"/>
+              <w:top w:w="70" w:type="dxa"/>
+              <w:bottom w:w="70" w:type="dxa"/>
+              <w:left w:w="90" w:type="dxa"/>
+              <w:right w:w="90" w:type="dxa"/>
             </w:tcMar>
           </w:tcPr>
           <w:p>
@@ -3929,14 +3929,14 @@
         </w:tc>
         <w:tc>
           <w:tcPr>
-            <w:tcW w:type="dxa" w:w="3010"/>
+            <w:tcW w:type="dxa" w:w="3202"/>
             <w:vAlign w:val="center"/>
             <w:shd w:fill="F2F5F9"/>
             <w:tcMar>
-              <w:top w:w="80" w:type="dxa"/>
-              <w:bottom w:w="80" w:type="dxa"/>
-              <w:left w:w="100" w:type="dxa"/>
-              <w:right w:w="100" w:type="dxa"/>
+              <w:top w:w="70" w:type="dxa"/>
+              <w:bottom w:w="70" w:type="dxa"/>
+              <w:left w:w="90" w:type="dxa"/>
+              <w:right w:w="90" w:type="dxa"/>
             </w:tcMar>
           </w:tcPr>
           <w:p>
@@ -3956,14 +3956,14 @@
         </w:tc>
         <w:tc>
           <w:tcPr>
-            <w:tcW w:type="dxa" w:w="3010"/>
+            <w:tcW w:type="dxa" w:w="3202"/>
             <w:vAlign w:val="center"/>
             <w:shd w:fill="F2F5F9"/>
             <w:tcMar>
-              <w:top w:w="80" w:type="dxa"/>
-              <w:bottom w:w="80" w:type="dxa"/>
-              <w:left w:w="100" w:type="dxa"/>
-              <w:right w:w="100" w:type="dxa"/>
+              <w:top w:w="70" w:type="dxa"/>
+              <w:bottom w:w="70" w:type="dxa"/>
+              <w:left w:w="90" w:type="dxa"/>
+              <w:right w:w="90" w:type="dxa"/>
             </w:tcMar>
           </w:tcPr>
           <w:p>
@@ -3985,7 +3985,7 @@
     </w:tbl>
     <w:p>
       <w:pPr>
-        <w:spacing w:after="120"/>
+        <w:spacing w:after="100"/>
       </w:pPr>
     </w:p>
     <w:tbl>
@@ -4004,9 +4004,9 @@
         </w:tblBorders>
       </w:tblPr>
       <w:tblGrid>
-        <w:gridCol w:w="3010"/>
-        <w:gridCol w:w="3010"/>
-        <w:gridCol w:w="3010"/>
+        <w:gridCol w:w="3202"/>
+        <w:gridCol w:w="3202"/>
+        <w:gridCol w:w="3202"/>
       </w:tblGrid>
       <w:tr>
         <w:trPr>
@@ -4016,7 +4016,7 @@
         </w:trPr>
         <w:tc>
           <w:tcPr>
-            <w:tcW w:type="dxa" w:w="3010"/>
+            <w:tcW w:type="dxa" w:w="3202"/>
             <w:vAlign w:val="center"/>
             <w:shd w:fill="1F3864"/>
             <w:tcMar>
@@ -4044,7 +4044,7 @@
         </w:tc>
         <w:tc>
           <w:tcPr>
-            <w:tcW w:type="dxa" w:w="3010"/>
+            <w:tcW w:type="dxa" w:w="3202"/>
             <w:vAlign w:val="center"/>
             <w:shd w:fill="1F3864"/>
             <w:tcMar>
@@ -4072,7 +4072,7 @@
         </w:tc>
         <w:tc>
           <w:tcPr>
-            <w:tcW w:type="dxa" w:w="3010"/>
+            <w:tcW w:type="dxa" w:w="3202"/>
             <w:vAlign w:val="center"/>
             <w:shd w:fill="1F3864"/>
             <w:tcMar>
@@ -4105,14 +4105,14 @@
         </w:trPr>
         <w:tc>
           <w:tcPr>
-            <w:tcW w:type="dxa" w:w="3010"/>
+            <w:tcW w:type="dxa" w:w="3202"/>
             <w:vAlign w:val="center"/>
             <w:shd w:fill="FFFFFF"/>
             <w:tcMar>
-              <w:top w:w="80" w:type="dxa"/>
-              <w:bottom w:w="80" w:type="dxa"/>
-              <w:left w:w="100" w:type="dxa"/>
-              <w:right w:w="100" w:type="dxa"/>
+              <w:top w:w="70" w:type="dxa"/>
+              <w:bottom w:w="70" w:type="dxa"/>
+              <w:left w:w="90" w:type="dxa"/>
+              <w:right w:w="90" w:type="dxa"/>
             </w:tcMar>
           </w:tcPr>
           <w:p>
@@ -4132,14 +4132,14 @@
         </w:tc>
         <w:tc>
           <w:tcPr>
-            <w:tcW w:type="dxa" w:w="3010"/>
+            <w:tcW w:type="dxa" w:w="3202"/>
             <w:vAlign w:val="center"/>
             <w:shd w:fill="FFFFFF"/>
             <w:tcMar>
-              <w:top w:w="80" w:type="dxa"/>
-              <w:bottom w:w="80" w:type="dxa"/>
-              <w:left w:w="100" w:type="dxa"/>
-              <w:right w:w="100" w:type="dxa"/>
+              <w:top w:w="70" w:type="dxa"/>
+              <w:bottom w:w="70" w:type="dxa"/>
+              <w:left w:w="90" w:type="dxa"/>
+              <w:right w:w="90" w:type="dxa"/>
             </w:tcMar>
           </w:tcPr>
           <w:p>
@@ -4159,14 +4159,14 @@
         </w:tc>
         <w:tc>
           <w:tcPr>
-            <w:tcW w:type="dxa" w:w="3010"/>
+            <w:tcW w:type="dxa" w:w="3202"/>
             <w:vAlign w:val="center"/>
             <w:shd w:fill="FFFFFF"/>
             <w:tcMar>
-              <w:top w:w="80" w:type="dxa"/>
-              <w:bottom w:w="80" w:type="dxa"/>
-              <w:left w:w="100" w:type="dxa"/>
-              <w:right w:w="100" w:type="dxa"/>
+              <w:top w:w="70" w:type="dxa"/>
+              <w:bottom w:w="70" w:type="dxa"/>
+              <w:left w:w="90" w:type="dxa"/>
+              <w:right w:w="90" w:type="dxa"/>
             </w:tcMar>
           </w:tcPr>
           <w:p>
@@ -4191,14 +4191,14 @@
         </w:trPr>
         <w:tc>
           <w:tcPr>
-            <w:tcW w:type="dxa" w:w="3010"/>
+            <w:tcW w:type="dxa" w:w="3202"/>
             <w:vAlign w:val="center"/>
             <w:shd w:fill="F2F5F9"/>
             <w:tcMar>
-              <w:top w:w="80" w:type="dxa"/>
-              <w:bottom w:w="80" w:type="dxa"/>
-              <w:left w:w="100" w:type="dxa"/>
-              <w:right w:w="100" w:type="dxa"/>
+              <w:top w:w="70" w:type="dxa"/>
+              <w:bottom w:w="70" w:type="dxa"/>
+              <w:left w:w="90" w:type="dxa"/>
+              <w:right w:w="90" w:type="dxa"/>
             </w:tcMar>
           </w:tcPr>
           <w:p>
@@ -4218,14 +4218,14 @@
         </w:tc>
         <w:tc>
           <w:tcPr>
-            <w:tcW w:type="dxa" w:w="3010"/>
+            <w:tcW w:type="dxa" w:w="3202"/>
             <w:vAlign w:val="center"/>
             <w:shd w:fill="F2F5F9"/>
             <w:tcMar>
-              <w:top w:w="80" w:type="dxa"/>
-              <w:bottom w:w="80" w:type="dxa"/>
-              <w:left w:w="100" w:type="dxa"/>
-              <w:right w:w="100" w:type="dxa"/>
+              <w:top w:w="70" w:type="dxa"/>
+              <w:bottom w:w="70" w:type="dxa"/>
+              <w:left w:w="90" w:type="dxa"/>
+              <w:right w:w="90" w:type="dxa"/>
             </w:tcMar>
           </w:tcPr>
           <w:p>
@@ -4245,14 +4245,14 @@
         </w:tc>
         <w:tc>
           <w:tcPr>
-            <w:tcW w:type="dxa" w:w="3010"/>
+            <w:tcW w:type="dxa" w:w="3202"/>
             <w:vAlign w:val="center"/>
             <w:shd w:fill="F2F5F9"/>
             <w:tcMar>
-              <w:top w:w="80" w:type="dxa"/>
-              <w:bottom w:w="80" w:type="dxa"/>
-              <w:left w:w="100" w:type="dxa"/>
-              <w:right w:w="100" w:type="dxa"/>
+              <w:top w:w="70" w:type="dxa"/>
+              <w:bottom w:w="70" w:type="dxa"/>
+              <w:left w:w="90" w:type="dxa"/>
+              <w:right w:w="90" w:type="dxa"/>
             </w:tcMar>
           </w:tcPr>
           <w:p>
@@ -4277,14 +4277,14 @@
         </w:trPr>
         <w:tc>
           <w:tcPr>
-            <w:tcW w:type="dxa" w:w="3010"/>
+            <w:tcW w:type="dxa" w:w="3202"/>
             <w:vAlign w:val="center"/>
             <w:shd w:fill="FFFFFF"/>
             <w:tcMar>
-              <w:top w:w="80" w:type="dxa"/>
-              <w:bottom w:w="80" w:type="dxa"/>
-              <w:left w:w="100" w:type="dxa"/>
-              <w:right w:w="100" w:type="dxa"/>
+              <w:top w:w="70" w:type="dxa"/>
+              <w:bottom w:w="70" w:type="dxa"/>
+              <w:left w:w="90" w:type="dxa"/>
+              <w:right w:w="90" w:type="dxa"/>
             </w:tcMar>
           </w:tcPr>
           <w:p>
@@ -4312,14 +4312,14 @@
         </w:tc>
         <w:tc>
           <w:tcPr>
-            <w:tcW w:type="dxa" w:w="3010"/>
+            <w:tcW w:type="dxa" w:w="3202"/>
             <w:vAlign w:val="center"/>
             <w:shd w:fill="FFFFFF"/>
             <w:tcMar>
-              <w:top w:w="80" w:type="dxa"/>
-              <w:bottom w:w="80" w:type="dxa"/>
-              <w:left w:w="100" w:type="dxa"/>
-              <w:right w:w="100" w:type="dxa"/>
+              <w:top w:w="70" w:type="dxa"/>
+              <w:bottom w:w="70" w:type="dxa"/>
+              <w:left w:w="90" w:type="dxa"/>
+              <w:right w:w="90" w:type="dxa"/>
             </w:tcMar>
           </w:tcPr>
           <w:p>
@@ -4339,14 +4339,14 @@
         </w:tc>
         <w:tc>
           <w:tcPr>
-            <w:tcW w:type="dxa" w:w="3010"/>
+            <w:tcW w:type="dxa" w:w="3202"/>
             <w:vAlign w:val="center"/>
             <w:shd w:fill="FFFFFF"/>
             <w:tcMar>
-              <w:top w:w="80" w:type="dxa"/>
-              <w:bottom w:w="80" w:type="dxa"/>
-              <w:left w:w="100" w:type="dxa"/>
-              <w:right w:w="100" w:type="dxa"/>
+              <w:top w:w="70" w:type="dxa"/>
+              <w:bottom w:w="70" w:type="dxa"/>
+              <w:left w:w="90" w:type="dxa"/>
+              <w:right w:w="90" w:type="dxa"/>
             </w:tcMar>
           </w:tcPr>
           <w:p>
@@ -4371,14 +4371,14 @@
         </w:trPr>
         <w:tc>
           <w:tcPr>
-            <w:tcW w:type="dxa" w:w="3010"/>
+            <w:tcW w:type="dxa" w:w="3202"/>
             <w:vAlign w:val="center"/>
             <w:shd w:fill="F2F5F9"/>
             <w:tcMar>
-              <w:top w:w="80" w:type="dxa"/>
-              <w:bottom w:w="80" w:type="dxa"/>
-              <w:left w:w="100" w:type="dxa"/>
-              <w:right w:w="100" w:type="dxa"/>
+              <w:top w:w="70" w:type="dxa"/>
+              <w:bottom w:w="70" w:type="dxa"/>
+              <w:left w:w="90" w:type="dxa"/>
+              <w:right w:w="90" w:type="dxa"/>
             </w:tcMar>
           </w:tcPr>
           <w:p>
@@ -4406,14 +4406,14 @@
         </w:tc>
         <w:tc>
           <w:tcPr>
-            <w:tcW w:type="dxa" w:w="3010"/>
+            <w:tcW w:type="dxa" w:w="3202"/>
             <w:vAlign w:val="center"/>
             <w:shd w:fill="F2F5F9"/>
             <w:tcMar>
-              <w:top w:w="80" w:type="dxa"/>
-              <w:bottom w:w="80" w:type="dxa"/>
-              <w:left w:w="100" w:type="dxa"/>
-              <w:right w:w="100" w:type="dxa"/>
+              <w:top w:w="70" w:type="dxa"/>
+              <w:bottom w:w="70" w:type="dxa"/>
+              <w:left w:w="90" w:type="dxa"/>
+              <w:right w:w="90" w:type="dxa"/>
             </w:tcMar>
           </w:tcPr>
           <w:p>
@@ -4433,14 +4433,14 @@
         </w:tc>
         <w:tc>
           <w:tcPr>
-            <w:tcW w:type="dxa" w:w="3010"/>
+            <w:tcW w:type="dxa" w:w="3202"/>
             <w:vAlign w:val="center"/>
             <w:shd w:fill="F2F5F9"/>
             <w:tcMar>
-              <w:top w:w="80" w:type="dxa"/>
-              <w:bottom w:w="80" w:type="dxa"/>
-              <w:left w:w="100" w:type="dxa"/>
-              <w:right w:w="100" w:type="dxa"/>
+              <w:top w:w="70" w:type="dxa"/>
+              <w:bottom w:w="70" w:type="dxa"/>
+              <w:left w:w="90" w:type="dxa"/>
+              <w:right w:w="90" w:type="dxa"/>
             </w:tcMar>
           </w:tcPr>
           <w:p>
@@ -4465,14 +4465,14 @@
         </w:trPr>
         <w:tc>
           <w:tcPr>
-            <w:tcW w:type="dxa" w:w="3010"/>
+            <w:tcW w:type="dxa" w:w="3202"/>
             <w:vAlign w:val="center"/>
             <w:shd w:fill="FFFFFF"/>
             <w:tcMar>
-              <w:top w:w="80" w:type="dxa"/>
-              <w:bottom w:w="80" w:type="dxa"/>
-              <w:left w:w="100" w:type="dxa"/>
-              <w:right w:w="100" w:type="dxa"/>
+              <w:top w:w="70" w:type="dxa"/>
+              <w:bottom w:w="70" w:type="dxa"/>
+              <w:left w:w="90" w:type="dxa"/>
+              <w:right w:w="90" w:type="dxa"/>
             </w:tcMar>
           </w:tcPr>
           <w:p>
@@ -4500,14 +4500,14 @@
         </w:tc>
         <w:tc>
           <w:tcPr>
-            <w:tcW w:type="dxa" w:w="3010"/>
+            <w:tcW w:type="dxa" w:w="3202"/>
             <w:vAlign w:val="center"/>
             <w:shd w:fill="FFFFFF"/>
             <w:tcMar>
-              <w:top w:w="80" w:type="dxa"/>
-              <w:bottom w:w="80" w:type="dxa"/>
-              <w:left w:w="100" w:type="dxa"/>
-              <w:right w:w="100" w:type="dxa"/>
+              <w:top w:w="70" w:type="dxa"/>
+              <w:bottom w:w="70" w:type="dxa"/>
+              <w:left w:w="90" w:type="dxa"/>
+              <w:right w:w="90" w:type="dxa"/>
             </w:tcMar>
           </w:tcPr>
           <w:p>
@@ -4527,14 +4527,14 @@
         </w:tc>
         <w:tc>
           <w:tcPr>
-            <w:tcW w:type="dxa" w:w="3010"/>
+            <w:tcW w:type="dxa" w:w="3202"/>
             <w:vAlign w:val="center"/>
             <w:shd w:fill="FFFFFF"/>
             <w:tcMar>
-              <w:top w:w="80" w:type="dxa"/>
-              <w:bottom w:w="80" w:type="dxa"/>
-              <w:left w:w="100" w:type="dxa"/>
-              <w:right w:w="100" w:type="dxa"/>
+              <w:top w:w="70" w:type="dxa"/>
+              <w:bottom w:w="70" w:type="dxa"/>
+              <w:left w:w="90" w:type="dxa"/>
+              <w:right w:w="90" w:type="dxa"/>
             </w:tcMar>
           </w:tcPr>
           <w:p>
@@ -4556,7 +4556,7 @@
     </w:tbl>
     <w:p>
       <w:pPr>
-        <w:spacing w:after="120"/>
+        <w:spacing w:after="100"/>
       </w:pPr>
     </w:p>
     <w:p>
@@ -4566,9 +4566,9 @@
       <w:r>
         <w:rPr>
           <w:color w:val="C8D2E1"/>
-          <w:sz w:val="16"/>
+          <w:sz w:val="14"/>
         </w:rPr>
-        <w:t>_________________________________________________________________________________</w:t>
+        <w:t>———————————————————————————————————————————————————————————————————————————</w:t>
       </w:r>
     </w:p>
     <w:p>
@@ -5192,9 +5192,9 @@
       <w:r>
         <w:rPr>
           <w:color w:val="C8D2E1"/>
-          <w:sz w:val="16"/>
+          <w:sz w:val="14"/>
         </w:rPr>
-        <w:t>_________________________________________________________________________________</w:t>
+        <w:t>———————————————————————————————————————————————————————————————————————————</w:t>
       </w:r>
     </w:p>
     <w:p>
@@ -5243,10 +5243,10 @@
         </w:tblBorders>
       </w:tblPr>
       <w:tblGrid>
-        <w:gridCol w:w="2257"/>
-        <w:gridCol w:w="2257"/>
-        <w:gridCol w:w="2257"/>
-        <w:gridCol w:w="2257"/>
+        <w:gridCol w:w="2401"/>
+        <w:gridCol w:w="2401"/>
+        <w:gridCol w:w="2401"/>
+        <w:gridCol w:w="2401"/>
       </w:tblGrid>
       <w:tr>
         <w:trPr>
@@ -5256,7 +5256,7 @@
         </w:trPr>
         <w:tc>
           <w:tcPr>
-            <w:tcW w:type="dxa" w:w="2257"/>
+            <w:tcW w:type="dxa" w:w="2401"/>
             <w:vAlign w:val="center"/>
             <w:shd w:fill="1F3864"/>
             <w:tcMar>
@@ -5284,7 +5284,7 @@
         </w:tc>
         <w:tc>
           <w:tcPr>
-            <w:tcW w:type="dxa" w:w="2257"/>
+            <w:tcW w:type="dxa" w:w="2401"/>
             <w:vAlign w:val="center"/>
             <w:shd w:fill="1F3864"/>
             <w:tcMar>
@@ -5312,7 +5312,7 @@
         </w:tc>
         <w:tc>
           <w:tcPr>
-            <w:tcW w:type="dxa" w:w="2257"/>
+            <w:tcW w:type="dxa" w:w="2401"/>
             <w:vAlign w:val="center"/>
             <w:shd w:fill="1F3864"/>
             <w:tcMar>
@@ -5340,7 +5340,7 @@
         </w:tc>
         <w:tc>
           <w:tcPr>
-            <w:tcW w:type="dxa" w:w="2257"/>
+            <w:tcW w:type="dxa" w:w="2401"/>
             <w:vAlign w:val="center"/>
             <w:shd w:fill="1F3864"/>
             <w:tcMar>
@@ -5373,14 +5373,14 @@
         </w:trPr>
         <w:tc>
           <w:tcPr>
-            <w:tcW w:type="dxa" w:w="2257"/>
+            <w:tcW w:type="dxa" w:w="2401"/>
             <w:vAlign w:val="center"/>
             <w:shd w:fill="FFFFFF"/>
             <w:tcMar>
-              <w:top w:w="80" w:type="dxa"/>
-              <w:bottom w:w="80" w:type="dxa"/>
-              <w:left w:w="100" w:type="dxa"/>
-              <w:right w:w="100" w:type="dxa"/>
+              <w:top w:w="70" w:type="dxa"/>
+              <w:bottom w:w="70" w:type="dxa"/>
+              <w:left w:w="90" w:type="dxa"/>
+              <w:right w:w="90" w:type="dxa"/>
             </w:tcMar>
           </w:tcPr>
           <w:p>
@@ -5400,14 +5400,14 @@
         </w:tc>
         <w:tc>
           <w:tcPr>
-            <w:tcW w:type="dxa" w:w="2257"/>
+            <w:tcW w:type="dxa" w:w="2401"/>
             <w:vAlign w:val="center"/>
             <w:shd w:fill="FFFFFF"/>
             <w:tcMar>
-              <w:top w:w="80" w:type="dxa"/>
-              <w:bottom w:w="80" w:type="dxa"/>
-              <w:left w:w="100" w:type="dxa"/>
-              <w:right w:w="100" w:type="dxa"/>
+              <w:top w:w="70" w:type="dxa"/>
+              <w:bottom w:w="70" w:type="dxa"/>
+              <w:left w:w="90" w:type="dxa"/>
+              <w:right w:w="90" w:type="dxa"/>
             </w:tcMar>
           </w:tcPr>
           <w:p>
@@ -5427,14 +5427,14 @@
         </w:tc>
         <w:tc>
           <w:tcPr>
-            <w:tcW w:type="dxa" w:w="2257"/>
+            <w:tcW w:type="dxa" w:w="2401"/>
             <w:vAlign w:val="center"/>
             <w:shd w:fill="FFFFFF"/>
             <w:tcMar>
-              <w:top w:w="80" w:type="dxa"/>
-              <w:bottom w:w="80" w:type="dxa"/>
-              <w:left w:w="100" w:type="dxa"/>
-              <w:right w:w="100" w:type="dxa"/>
+              <w:top w:w="70" w:type="dxa"/>
+              <w:bottom w:w="70" w:type="dxa"/>
+              <w:left w:w="90" w:type="dxa"/>
+              <w:right w:w="90" w:type="dxa"/>
             </w:tcMar>
           </w:tcPr>
           <w:p>
@@ -5454,14 +5454,14 @@
         </w:tc>
         <w:tc>
           <w:tcPr>
-            <w:tcW w:type="dxa" w:w="2257"/>
+            <w:tcW w:type="dxa" w:w="2401"/>
             <w:vAlign w:val="center"/>
             <w:shd w:fill="FFFFFF"/>
             <w:tcMar>
-              <w:top w:w="80" w:type="dxa"/>
-              <w:bottom w:w="80" w:type="dxa"/>
-              <w:left w:w="100" w:type="dxa"/>
-              <w:right w:w="100" w:type="dxa"/>
+              <w:top w:w="70" w:type="dxa"/>
+              <w:bottom w:w="70" w:type="dxa"/>
+              <w:left w:w="90" w:type="dxa"/>
+              <w:right w:w="90" w:type="dxa"/>
             </w:tcMar>
           </w:tcPr>
           <w:p>
@@ -5486,14 +5486,14 @@
         </w:trPr>
         <w:tc>
           <w:tcPr>
-            <w:tcW w:type="dxa" w:w="2257"/>
+            <w:tcW w:type="dxa" w:w="2401"/>
             <w:vAlign w:val="center"/>
             <w:shd w:fill="F2F5F9"/>
             <w:tcMar>
-              <w:top w:w="80" w:type="dxa"/>
-              <w:bottom w:w="80" w:type="dxa"/>
-              <w:left w:w="100" w:type="dxa"/>
-              <w:right w:w="100" w:type="dxa"/>
+              <w:top w:w="70" w:type="dxa"/>
+              <w:bottom w:w="70" w:type="dxa"/>
+              <w:left w:w="90" w:type="dxa"/>
+              <w:right w:w="90" w:type="dxa"/>
             </w:tcMar>
           </w:tcPr>
           <w:p>
@@ -5513,14 +5513,14 @@
         </w:tc>
         <w:tc>
           <w:tcPr>
-            <w:tcW w:type="dxa" w:w="2257"/>
+            <w:tcW w:type="dxa" w:w="2401"/>
             <w:vAlign w:val="center"/>
             <w:shd w:fill="F2F5F9"/>
             <w:tcMar>
-              <w:top w:w="80" w:type="dxa"/>
-              <w:bottom w:w="80" w:type="dxa"/>
-              <w:left w:w="100" w:type="dxa"/>
-              <w:right w:w="100" w:type="dxa"/>
+              <w:top w:w="70" w:type="dxa"/>
+              <w:bottom w:w="70" w:type="dxa"/>
+              <w:left w:w="90" w:type="dxa"/>
+              <w:right w:w="90" w:type="dxa"/>
             </w:tcMar>
           </w:tcPr>
           <w:p>
@@ -5540,14 +5540,14 @@
         </w:tc>
         <w:tc>
           <w:tcPr>
-            <w:tcW w:type="dxa" w:w="2257"/>
+            <w:tcW w:type="dxa" w:w="2401"/>
             <w:vAlign w:val="center"/>
             <w:shd w:fill="F2F5F9"/>
             <w:tcMar>
-              <w:top w:w="80" w:type="dxa"/>
-              <w:bottom w:w="80" w:type="dxa"/>
-              <w:left w:w="100" w:type="dxa"/>
-              <w:right w:w="100" w:type="dxa"/>
+              <w:top w:w="70" w:type="dxa"/>
+              <w:bottom w:w="70" w:type="dxa"/>
+              <w:left w:w="90" w:type="dxa"/>
+              <w:right w:w="90" w:type="dxa"/>
             </w:tcMar>
           </w:tcPr>
           <w:p>
@@ -5567,14 +5567,14 @@
         </w:tc>
         <w:tc>
           <w:tcPr>
-            <w:tcW w:type="dxa" w:w="2257"/>
+            <w:tcW w:type="dxa" w:w="2401"/>
             <w:vAlign w:val="center"/>
             <w:shd w:fill="F2F5F9"/>
             <w:tcMar>
-              <w:top w:w="80" w:type="dxa"/>
-              <w:bottom w:w="80" w:type="dxa"/>
-              <w:left w:w="100" w:type="dxa"/>
-              <w:right w:w="100" w:type="dxa"/>
+              <w:top w:w="70" w:type="dxa"/>
+              <w:bottom w:w="70" w:type="dxa"/>
+              <w:left w:w="90" w:type="dxa"/>
+              <w:right w:w="90" w:type="dxa"/>
             </w:tcMar>
           </w:tcPr>
           <w:p>
@@ -5599,14 +5599,14 @@
         </w:trPr>
         <w:tc>
           <w:tcPr>
-            <w:tcW w:type="dxa" w:w="2257"/>
+            <w:tcW w:type="dxa" w:w="2401"/>
             <w:vAlign w:val="center"/>
             <w:shd w:fill="FFFFFF"/>
             <w:tcMar>
-              <w:top w:w="80" w:type="dxa"/>
-              <w:bottom w:w="80" w:type="dxa"/>
-              <w:left w:w="100" w:type="dxa"/>
-              <w:right w:w="100" w:type="dxa"/>
+              <w:top w:w="70" w:type="dxa"/>
+              <w:bottom w:w="70" w:type="dxa"/>
+              <w:left w:w="90" w:type="dxa"/>
+              <w:right w:w="90" w:type="dxa"/>
             </w:tcMar>
           </w:tcPr>
           <w:p>
@@ -5627,14 +5627,14 @@
         </w:tc>
         <w:tc>
           <w:tcPr>
-            <w:tcW w:type="dxa" w:w="2257"/>
+            <w:tcW w:type="dxa" w:w="2401"/>
             <w:vAlign w:val="center"/>
             <w:shd w:fill="FFFFFF"/>
             <w:tcMar>
-              <w:top w:w="80" w:type="dxa"/>
-              <w:bottom w:w="80" w:type="dxa"/>
-              <w:left w:w="100" w:type="dxa"/>
-              <w:right w:w="100" w:type="dxa"/>
+              <w:top w:w="70" w:type="dxa"/>
+              <w:bottom w:w="70" w:type="dxa"/>
+              <w:left w:w="90" w:type="dxa"/>
+              <w:right w:w="90" w:type="dxa"/>
             </w:tcMar>
           </w:tcPr>
           <w:p>
@@ -5655,14 +5655,14 @@
         </w:tc>
         <w:tc>
           <w:tcPr>
-            <w:tcW w:type="dxa" w:w="2257"/>
+            <w:tcW w:type="dxa" w:w="2401"/>
             <w:vAlign w:val="center"/>
             <w:shd w:fill="FFFFFF"/>
             <w:tcMar>
-              <w:top w:w="80" w:type="dxa"/>
-              <w:bottom w:w="80" w:type="dxa"/>
-              <w:left w:w="100" w:type="dxa"/>
-              <w:right w:w="100" w:type="dxa"/>
+              <w:top w:w="70" w:type="dxa"/>
+              <w:bottom w:w="70" w:type="dxa"/>
+              <w:left w:w="90" w:type="dxa"/>
+              <w:right w:w="90" w:type="dxa"/>
             </w:tcMar>
           </w:tcPr>
           <w:p>
@@ -5683,14 +5683,14 @@
         </w:tc>
         <w:tc>
           <w:tcPr>
-            <w:tcW w:type="dxa" w:w="2257"/>
+            <w:tcW w:type="dxa" w:w="2401"/>
             <w:vAlign w:val="center"/>
             <w:shd w:fill="FFFFFF"/>
             <w:tcMar>
-              <w:top w:w="80" w:type="dxa"/>
-              <w:bottom w:w="80" w:type="dxa"/>
-              <w:left w:w="100" w:type="dxa"/>
-              <w:right w:w="100" w:type="dxa"/>
+              <w:top w:w="70" w:type="dxa"/>
+              <w:bottom w:w="70" w:type="dxa"/>
+              <w:left w:w="90" w:type="dxa"/>
+              <w:right w:w="90" w:type="dxa"/>
             </w:tcMar>
           </w:tcPr>
           <w:p>
@@ -5716,14 +5716,14 @@
         </w:trPr>
         <w:tc>
           <w:tcPr>
-            <w:tcW w:type="dxa" w:w="2257"/>
+            <w:tcW w:type="dxa" w:w="2401"/>
             <w:vAlign w:val="center"/>
             <w:shd w:fill="F2F5F9"/>
             <w:tcMar>
-              <w:top w:w="80" w:type="dxa"/>
-              <w:bottom w:w="80" w:type="dxa"/>
-              <w:left w:w="100" w:type="dxa"/>
-              <w:right w:w="100" w:type="dxa"/>
+              <w:top w:w="70" w:type="dxa"/>
+              <w:bottom w:w="70" w:type="dxa"/>
+              <w:left w:w="90" w:type="dxa"/>
+              <w:right w:w="90" w:type="dxa"/>
             </w:tcMar>
           </w:tcPr>
           <w:p>
@@ -5743,14 +5743,14 @@
         </w:tc>
         <w:tc>
           <w:tcPr>
-            <w:tcW w:type="dxa" w:w="2257"/>
+            <w:tcW w:type="dxa" w:w="2401"/>
             <w:vAlign w:val="center"/>
             <w:shd w:fill="F2F5F9"/>
             <w:tcMar>
-              <w:top w:w="80" w:type="dxa"/>
-              <w:bottom w:w="80" w:type="dxa"/>
-              <w:left w:w="100" w:type="dxa"/>
-              <w:right w:w="100" w:type="dxa"/>
+              <w:top w:w="70" w:type="dxa"/>
+              <w:bottom w:w="70" w:type="dxa"/>
+              <w:left w:w="90" w:type="dxa"/>
+              <w:right w:w="90" w:type="dxa"/>
             </w:tcMar>
           </w:tcPr>
           <w:p>
@@ -5770,14 +5770,14 @@
         </w:tc>
         <w:tc>
           <w:tcPr>
-            <w:tcW w:type="dxa" w:w="2257"/>
+            <w:tcW w:type="dxa" w:w="2401"/>
             <w:vAlign w:val="center"/>
             <w:shd w:fill="F2F5F9"/>
             <w:tcMar>
-              <w:top w:w="80" w:type="dxa"/>
-              <w:bottom w:w="80" w:type="dxa"/>
-              <w:left w:w="100" w:type="dxa"/>
-              <w:right w:w="100" w:type="dxa"/>
+              <w:top w:w="70" w:type="dxa"/>
+              <w:bottom w:w="70" w:type="dxa"/>
+              <w:left w:w="90" w:type="dxa"/>
+              <w:right w:w="90" w:type="dxa"/>
             </w:tcMar>
           </w:tcPr>
           <w:p>
@@ -5797,14 +5797,14 @@
         </w:tc>
         <w:tc>
           <w:tcPr>
-            <w:tcW w:type="dxa" w:w="2257"/>
+            <w:tcW w:type="dxa" w:w="2401"/>
             <w:vAlign w:val="center"/>
             <w:shd w:fill="F2F5F9"/>
             <w:tcMar>
-              <w:top w:w="80" w:type="dxa"/>
-              <w:bottom w:w="80" w:type="dxa"/>
-              <w:left w:w="100" w:type="dxa"/>
-              <w:right w:w="100" w:type="dxa"/>
+              <w:top w:w="70" w:type="dxa"/>
+              <w:bottom w:w="70" w:type="dxa"/>
+              <w:left w:w="90" w:type="dxa"/>
+              <w:right w:w="90" w:type="dxa"/>
             </w:tcMar>
           </w:tcPr>
           <w:p>
@@ -5829,14 +5829,14 @@
         </w:trPr>
         <w:tc>
           <w:tcPr>
-            <w:tcW w:type="dxa" w:w="2257"/>
+            <w:tcW w:type="dxa" w:w="2401"/>
             <w:vAlign w:val="center"/>
             <w:shd w:fill="FFFFFF"/>
             <w:tcMar>
-              <w:top w:w="80" w:type="dxa"/>
-              <w:bottom w:w="80" w:type="dxa"/>
-              <w:left w:w="100" w:type="dxa"/>
-              <w:right w:w="100" w:type="dxa"/>
+              <w:top w:w="70" w:type="dxa"/>
+              <w:bottom w:w="70" w:type="dxa"/>
+              <w:left w:w="90" w:type="dxa"/>
+              <w:right w:w="90" w:type="dxa"/>
             </w:tcMar>
           </w:tcPr>
           <w:p>
@@ -5857,14 +5857,14 @@
         </w:tc>
         <w:tc>
           <w:tcPr>
-            <w:tcW w:type="dxa" w:w="2257"/>
+            <w:tcW w:type="dxa" w:w="2401"/>
             <w:vAlign w:val="center"/>
             <w:shd w:fill="FFFFFF"/>
             <w:tcMar>
-              <w:top w:w="80" w:type="dxa"/>
-              <w:bottom w:w="80" w:type="dxa"/>
-              <w:left w:w="100" w:type="dxa"/>
-              <w:right w:w="100" w:type="dxa"/>
+              <w:top w:w="70" w:type="dxa"/>
+              <w:bottom w:w="70" w:type="dxa"/>
+              <w:left w:w="90" w:type="dxa"/>
+              <w:right w:w="90" w:type="dxa"/>
             </w:tcMar>
           </w:tcPr>
           <w:p>
@@ -5885,14 +5885,14 @@
         </w:tc>
         <w:tc>
           <w:tcPr>
-            <w:tcW w:type="dxa" w:w="2257"/>
+            <w:tcW w:type="dxa" w:w="2401"/>
             <w:vAlign w:val="center"/>
             <w:shd w:fill="FFFFFF"/>
             <w:tcMar>
-              <w:top w:w="80" w:type="dxa"/>
-              <w:bottom w:w="80" w:type="dxa"/>
-              <w:left w:w="100" w:type="dxa"/>
-              <w:right w:w="100" w:type="dxa"/>
+              <w:top w:w="70" w:type="dxa"/>
+              <w:bottom w:w="70" w:type="dxa"/>
+              <w:left w:w="90" w:type="dxa"/>
+              <w:right w:w="90" w:type="dxa"/>
             </w:tcMar>
           </w:tcPr>
           <w:p>
@@ -5913,14 +5913,14 @@
         </w:tc>
         <w:tc>
           <w:tcPr>
-            <w:tcW w:type="dxa" w:w="2257"/>
+            <w:tcW w:type="dxa" w:w="2401"/>
             <w:vAlign w:val="center"/>
             <w:shd w:fill="FFFFFF"/>
             <w:tcMar>
-              <w:top w:w="80" w:type="dxa"/>
-              <w:bottom w:w="80" w:type="dxa"/>
-              <w:left w:w="100" w:type="dxa"/>
-              <w:right w:w="100" w:type="dxa"/>
+              <w:top w:w="70" w:type="dxa"/>
+              <w:bottom w:w="70" w:type="dxa"/>
+              <w:left w:w="90" w:type="dxa"/>
+              <w:right w:w="90" w:type="dxa"/>
             </w:tcMar>
           </w:tcPr>
           <w:p>
@@ -5943,7 +5943,7 @@
     </w:tbl>
     <w:p>
       <w:pPr>
-        <w:spacing w:after="120"/>
+        <w:spacing w:after="100"/>
       </w:pPr>
     </w:p>
     <w:p>
@@ -5977,10 +5977,10 @@
         </w:tblBorders>
       </w:tblPr>
       <w:tblGrid>
-        <w:gridCol w:w="2257"/>
-        <w:gridCol w:w="2257"/>
-        <w:gridCol w:w="2257"/>
-        <w:gridCol w:w="2257"/>
+        <w:gridCol w:w="2401"/>
+        <w:gridCol w:w="2401"/>
+        <w:gridCol w:w="2401"/>
+        <w:gridCol w:w="2401"/>
       </w:tblGrid>
       <w:tr>
         <w:trPr>
@@ -5990,7 +5990,7 @@
         </w:trPr>
         <w:tc>
           <w:tcPr>
-            <w:tcW w:type="dxa" w:w="2257"/>
+            <w:tcW w:type="dxa" w:w="2401"/>
             <w:vAlign w:val="center"/>
             <w:shd w:fill="1F3864"/>
             <w:tcMar>
@@ -6018,7 +6018,7 @@
         </w:tc>
         <w:tc>
           <w:tcPr>
-            <w:tcW w:type="dxa" w:w="2257"/>
+            <w:tcW w:type="dxa" w:w="2401"/>
             <w:vAlign w:val="center"/>
             <w:shd w:fill="1F3864"/>
             <w:tcMar>
@@ -6046,7 +6046,7 @@
         </w:tc>
         <w:tc>
           <w:tcPr>
-            <w:tcW w:type="dxa" w:w="2257"/>
+            <w:tcW w:type="dxa" w:w="2401"/>
             <w:vAlign w:val="center"/>
             <w:shd w:fill="1F3864"/>
             <w:tcMar>
@@ -6074,7 +6074,7 @@
         </w:tc>
         <w:tc>
           <w:tcPr>
-            <w:tcW w:type="dxa" w:w="2257"/>
+            <w:tcW w:type="dxa" w:w="2401"/>
             <w:vAlign w:val="center"/>
             <w:shd w:fill="1F3864"/>
             <w:tcMar>
@@ -6107,14 +6107,14 @@
         </w:trPr>
         <w:tc>
           <w:tcPr>
-            <w:tcW w:type="dxa" w:w="2257"/>
+            <w:tcW w:type="dxa" w:w="2401"/>
             <w:vAlign w:val="center"/>
             <w:shd w:fill="FFFFFF"/>
             <w:tcMar>
-              <w:top w:w="80" w:type="dxa"/>
-              <w:bottom w:w="80" w:type="dxa"/>
-              <w:left w:w="100" w:type="dxa"/>
-              <w:right w:w="100" w:type="dxa"/>
+              <w:top w:w="70" w:type="dxa"/>
+              <w:bottom w:w="70" w:type="dxa"/>
+              <w:left w:w="90" w:type="dxa"/>
+              <w:right w:w="90" w:type="dxa"/>
             </w:tcMar>
           </w:tcPr>
           <w:p>
@@ -6135,14 +6135,14 @@
         </w:tc>
         <w:tc>
           <w:tcPr>
-            <w:tcW w:type="dxa" w:w="2257"/>
+            <w:tcW w:type="dxa" w:w="2401"/>
             <w:vAlign w:val="center"/>
             <w:shd w:fill="FFFFFF"/>
             <w:tcMar>
-              <w:top w:w="80" w:type="dxa"/>
-              <w:bottom w:w="80" w:type="dxa"/>
-              <w:left w:w="100" w:type="dxa"/>
-              <w:right w:w="100" w:type="dxa"/>
+              <w:top w:w="70" w:type="dxa"/>
+              <w:bottom w:w="70" w:type="dxa"/>
+              <w:left w:w="90" w:type="dxa"/>
+              <w:right w:w="90" w:type="dxa"/>
             </w:tcMar>
           </w:tcPr>
           <w:p>
@@ -6162,14 +6162,14 @@
         </w:tc>
         <w:tc>
           <w:tcPr>
-            <w:tcW w:type="dxa" w:w="2257"/>
+            <w:tcW w:type="dxa" w:w="2401"/>
             <w:vAlign w:val="center"/>
             <w:shd w:fill="FFFFFF"/>
             <w:tcMar>
-              <w:top w:w="80" w:type="dxa"/>
-              <w:bottom w:w="80" w:type="dxa"/>
-              <w:left w:w="100" w:type="dxa"/>
-              <w:right w:w="100" w:type="dxa"/>
+              <w:top w:w="70" w:type="dxa"/>
+              <w:bottom w:w="70" w:type="dxa"/>
+              <w:left w:w="90" w:type="dxa"/>
+              <w:right w:w="90" w:type="dxa"/>
             </w:tcMar>
           </w:tcPr>
           <w:p>
@@ -6189,14 +6189,14 @@
         </w:tc>
         <w:tc>
           <w:tcPr>
-            <w:tcW w:type="dxa" w:w="2257"/>
+            <w:tcW w:type="dxa" w:w="2401"/>
             <w:vAlign w:val="center"/>
             <w:shd w:fill="FFFFFF"/>
             <w:tcMar>
-              <w:top w:w="80" w:type="dxa"/>
-              <w:bottom w:w="80" w:type="dxa"/>
-              <w:left w:w="100" w:type="dxa"/>
-              <w:right w:w="100" w:type="dxa"/>
+              <w:top w:w="70" w:type="dxa"/>
+              <w:bottom w:w="70" w:type="dxa"/>
+              <w:left w:w="90" w:type="dxa"/>
+              <w:right w:w="90" w:type="dxa"/>
             </w:tcMar>
           </w:tcPr>
           <w:p>
@@ -6221,14 +6221,14 @@
         </w:trPr>
         <w:tc>
           <w:tcPr>
-            <w:tcW w:type="dxa" w:w="2257"/>
+            <w:tcW w:type="dxa" w:w="2401"/>
             <w:vAlign w:val="center"/>
             <w:shd w:fill="F2F5F9"/>
             <w:tcMar>
-              <w:top w:w="80" w:type="dxa"/>
-              <w:bottom w:w="80" w:type="dxa"/>
-              <w:left w:w="100" w:type="dxa"/>
-              <w:right w:w="100" w:type="dxa"/>
+              <w:top w:w="70" w:type="dxa"/>
+              <w:bottom w:w="70" w:type="dxa"/>
+              <w:left w:w="90" w:type="dxa"/>
+              <w:right w:w="90" w:type="dxa"/>
             </w:tcMar>
           </w:tcPr>
           <w:p>
@@ -6249,14 +6249,14 @@
         </w:tc>
         <w:tc>
           <w:tcPr>
-            <w:tcW w:type="dxa" w:w="2257"/>
+            <w:tcW w:type="dxa" w:w="2401"/>
             <w:vAlign w:val="center"/>
             <w:shd w:fill="F2F5F9"/>
             <w:tcMar>
-              <w:top w:w="80" w:type="dxa"/>
-              <w:bottom w:w="80" w:type="dxa"/>
-              <w:left w:w="100" w:type="dxa"/>
-              <w:right w:w="100" w:type="dxa"/>
+              <w:top w:w="70" w:type="dxa"/>
+              <w:bottom w:w="70" w:type="dxa"/>
+              <w:left w:w="90" w:type="dxa"/>
+              <w:right w:w="90" w:type="dxa"/>
             </w:tcMar>
           </w:tcPr>
           <w:p>
@@ -6276,14 +6276,14 @@
         </w:tc>
         <w:tc>
           <w:tcPr>
-            <w:tcW w:type="dxa" w:w="2257"/>
+            <w:tcW w:type="dxa" w:w="2401"/>
             <w:vAlign w:val="center"/>
             <w:shd w:fill="F2F5F9"/>
             <w:tcMar>
-              <w:top w:w="80" w:type="dxa"/>
-              <w:bottom w:w="80" w:type="dxa"/>
-              <w:left w:w="100" w:type="dxa"/>
-              <w:right w:w="100" w:type="dxa"/>
+              <w:top w:w="70" w:type="dxa"/>
+              <w:bottom w:w="70" w:type="dxa"/>
+              <w:left w:w="90" w:type="dxa"/>
+              <w:right w:w="90" w:type="dxa"/>
             </w:tcMar>
           </w:tcPr>
           <w:p>
@@ -6303,14 +6303,14 @@
         </w:tc>
         <w:tc>
           <w:tcPr>
-            <w:tcW w:type="dxa" w:w="2257"/>
+            <w:tcW w:type="dxa" w:w="2401"/>
             <w:vAlign w:val="center"/>
             <w:shd w:fill="F2F5F9"/>
             <w:tcMar>
-              <w:top w:w="80" w:type="dxa"/>
-              <w:bottom w:w="80" w:type="dxa"/>
-              <w:left w:w="100" w:type="dxa"/>
-              <w:right w:w="100" w:type="dxa"/>
+              <w:top w:w="70" w:type="dxa"/>
+              <w:bottom w:w="70" w:type="dxa"/>
+              <w:left w:w="90" w:type="dxa"/>
+              <w:right w:w="90" w:type="dxa"/>
             </w:tcMar>
           </w:tcPr>
           <w:p>
@@ -6335,14 +6335,14 @@
         </w:trPr>
         <w:tc>
           <w:tcPr>
-            <w:tcW w:type="dxa" w:w="2257"/>
+            <w:tcW w:type="dxa" w:w="2401"/>
             <w:vAlign w:val="center"/>
             <w:shd w:fill="FFFFFF"/>
             <w:tcMar>
-              <w:top w:w="80" w:type="dxa"/>
-              <w:bottom w:w="80" w:type="dxa"/>
-              <w:left w:w="100" w:type="dxa"/>
-              <w:right w:w="100" w:type="dxa"/>
+              <w:top w:w="70" w:type="dxa"/>
+              <w:bottom w:w="70" w:type="dxa"/>
+              <w:left w:w="90" w:type="dxa"/>
+              <w:right w:w="90" w:type="dxa"/>
             </w:tcMar>
           </w:tcPr>
           <w:p>
@@ -6363,14 +6363,14 @@
         </w:tc>
         <w:tc>
           <w:tcPr>
-            <w:tcW w:type="dxa" w:w="2257"/>
+            <w:tcW w:type="dxa" w:w="2401"/>
             <w:vAlign w:val="center"/>
             <w:shd w:fill="FFFFFF"/>
             <w:tcMar>
-              <w:top w:w="80" w:type="dxa"/>
-              <w:bottom w:w="80" w:type="dxa"/>
-              <w:left w:w="100" w:type="dxa"/>
-              <w:right w:w="100" w:type="dxa"/>
+              <w:top w:w="70" w:type="dxa"/>
+              <w:bottom w:w="70" w:type="dxa"/>
+              <w:left w:w="90" w:type="dxa"/>
+              <w:right w:w="90" w:type="dxa"/>
             </w:tcMar>
           </w:tcPr>
           <w:p>
@@ -6390,14 +6390,14 @@
         </w:tc>
         <w:tc>
           <w:tcPr>
-            <w:tcW w:type="dxa" w:w="2257"/>
+            <w:tcW w:type="dxa" w:w="2401"/>
             <w:vAlign w:val="center"/>
             <w:shd w:fill="FFFFFF"/>
             <w:tcMar>
-              <w:top w:w="80" w:type="dxa"/>
-              <w:bottom w:w="80" w:type="dxa"/>
-              <w:left w:w="100" w:type="dxa"/>
-              <w:right w:w="100" w:type="dxa"/>
+              <w:top w:w="70" w:type="dxa"/>
+              <w:bottom w:w="70" w:type="dxa"/>
+              <w:left w:w="90" w:type="dxa"/>
+              <w:right w:w="90" w:type="dxa"/>
             </w:tcMar>
           </w:tcPr>
           <w:p>
@@ -6417,14 +6417,14 @@
         </w:tc>
         <w:tc>
           <w:tcPr>
-            <w:tcW w:type="dxa" w:w="2257"/>
+            <w:tcW w:type="dxa" w:w="2401"/>
             <w:vAlign w:val="center"/>
             <w:shd w:fill="FFFFFF"/>
             <w:tcMar>
-              <w:top w:w="80" w:type="dxa"/>
-              <w:bottom w:w="80" w:type="dxa"/>
-              <w:left w:w="100" w:type="dxa"/>
-              <w:right w:w="100" w:type="dxa"/>
+              <w:top w:w="70" w:type="dxa"/>
+              <w:bottom w:w="70" w:type="dxa"/>
+              <w:left w:w="90" w:type="dxa"/>
+              <w:right w:w="90" w:type="dxa"/>
             </w:tcMar>
           </w:tcPr>
           <w:p>
@@ -6446,7 +6446,7 @@
     </w:tbl>
     <w:p>
       <w:pPr>
-        <w:spacing w:after="120"/>
+        <w:spacing w:after="100"/>
       </w:pPr>
     </w:p>
     <w:p>
@@ -6486,9 +6486,9 @@
       <w:r>
         <w:rPr>
           <w:color w:val="C8D2E1"/>
-          <w:sz w:val="16"/>
+          <w:sz w:val="14"/>
         </w:rPr>
-        <w:t>_________________________________________________________________________________</w:t>
+        <w:t>———————————————————————————————————————————————————————————————————————————</w:t>
       </w:r>
     </w:p>
     <w:p>
@@ -6840,9 +6840,9 @@
       <w:r>
         <w:rPr>
           <w:color w:val="C8D2E1"/>
-          <w:sz w:val="16"/>
+          <w:sz w:val="14"/>
         </w:rPr>
-        <w:t>_________________________________________________________________________________</w:t>
+        <w:t>———————————————————————————————————————————————————————————————————————————</w:t>
       </w:r>
     </w:p>
     <w:p>
@@ -7077,9 +7077,9 @@
       <w:r>
         <w:rPr>
           <w:color w:val="C8D2E1"/>
-          <w:sz w:val="16"/>
+          <w:sz w:val="14"/>
         </w:rPr>
-        <w:t>_________________________________________________________________________________</w:t>
+        <w:t>———————————————————————————————————————————————————————————————————————————</w:t>
       </w:r>
     </w:p>
     <w:p>
@@ -7318,9 +7318,9 @@
       <w:r>
         <w:rPr>
           <w:color w:val="C8D2E1"/>
-          <w:sz w:val="16"/>
+          <w:sz w:val="14"/>
         </w:rPr>
-        <w:t>_________________________________________________________________________________</w:t>
+        <w:t>———————————————————————————————————————————————————————————————————————————</w:t>
       </w:r>
     </w:p>
     <w:p>
@@ -7375,9 +7375,9 @@
       <w:r>
         <w:rPr>
           <w:color w:val="C8D2E1"/>
-          <w:sz w:val="16"/>
+          <w:sz w:val="14"/>
         </w:rPr>
-        <w:t>_________________________________________________________________________________</w:t>
+        <w:t>———————————————————————————————————————————————————————————————————————————</w:t>
       </w:r>
     </w:p>
     <w:p>
@@ -7423,13 +7423,53 @@
       </w:r>
     </w:p>
     <w:sectPr>
+      <w:headerReference w:type="default" r:id="rId9"/>
+      <w:footerReference w:type="default" r:id="rId10"/>
       <w:pgSz w:w="11909" w:h="16834"/>
-      <w:pgMar w:top="1440" w:right="1440" w:bottom="1440" w:left="1440" w:header="720" w:footer="720" w:gutter="0"/>
+      <w:pgMar w:top="1152" w:right="1152" w:bottom="1152" w:left="1152" w:header="720" w:footer="720" w:gutter="0"/>
       <w:cols w:space="720"/>
       <w:docGrid w:linePitch="360"/>
     </w:sectPr>
   </w:body>
 </w:document>
+</file>
+
+<file path=word/footer1.xml><?xml version="1.0" encoding="utf-8"?>
+<w:ftr xmlns:m="http://schemas.openxmlformats.org/officeDocument/2006/math" xmlns:mc="http://schemas.openxmlformats.org/markup-compatibility/2006" xmlns:mo="http://schemas.microsoft.com/office/mac/office/2008/main" xmlns:mv="urn:schemas-microsoft-com:mac:vml" xmlns:o="urn:schemas-microsoft-com:office:office" xmlns:r="http://schemas.openxmlformats.org/officeDocument/2006/relationships" xmlns:v="urn:schemas-microsoft-com:vml" xmlns:w10="urn:schemas-microsoft-com:office:word" xmlns:w14="http://schemas.microsoft.com/office/word/2010/wordml" xmlns:w="http://schemas.openxmlformats.org/wordprocessingml/2006/main" xmlns:wne="http://schemas.microsoft.com/office/word/2006/wordml" xmlns:wp14="http://schemas.microsoft.com/office/word/2010/wordprocessingDrawing" xmlns:wp="http://schemas.openxmlformats.org/drawingml/2006/wordprocessingDrawing" xmlns:wpc="http://schemas.microsoft.com/office/word/2010/wordprocessingCanvas" xmlns:wpg="http://schemas.microsoft.com/office/word/2010/wordprocessingGroup" xmlns:wpi="http://schemas.microsoft.com/office/word/2010/wordprocessingInk" xmlns:wps="http://schemas.microsoft.com/office/word/2010/wordprocessingShape" mc:Ignorable="w14 wp14">
+  <w:p>
+    <w:pPr>
+      <w:pStyle w:val="Footer"/>
+      <w:jc w:val="left"/>
+    </w:pPr>
+    <w:r>
+      <w:rPr>
+        <w:rFonts w:ascii="Calibri" w:hAnsi="Calibri"/>
+        <w:color w:val="646464"/>
+        <w:sz w:val="17"/>
+      </w:rPr>
+      <w:t>Buku Kurikulum KPT-OBE SISTEKIN 2026  |  FSTI Universitas Widyagama Malang</w:t>
+    </w:r>
+  </w:p>
+</w:ftr>
+</file>
+
+<file path=word/header1.xml><?xml version="1.0" encoding="utf-8"?>
+<w:hdr xmlns:m="http://schemas.openxmlformats.org/officeDocument/2006/math" xmlns:mc="http://schemas.openxmlformats.org/markup-compatibility/2006" xmlns:mo="http://schemas.microsoft.com/office/mac/office/2008/main" xmlns:mv="urn:schemas-microsoft-com:mac:vml" xmlns:o="urn:schemas-microsoft-com:office:office" xmlns:r="http://schemas.openxmlformats.org/officeDocument/2006/relationships" xmlns:v="urn:schemas-microsoft-com:vml" xmlns:w10="urn:schemas-microsoft-com:office:word" xmlns:w14="http://schemas.microsoft.com/office/word/2010/wordml" xmlns:w="http://schemas.openxmlformats.org/wordprocessingml/2006/main" xmlns:wne="http://schemas.microsoft.com/office/word/2006/wordml" xmlns:wp14="http://schemas.microsoft.com/office/word/2010/wordprocessingDrawing" xmlns:wp="http://schemas.openxmlformats.org/drawingml/2006/wordprocessingDrawing" xmlns:wpc="http://schemas.microsoft.com/office/word/2010/wordprocessingCanvas" xmlns:wpg="http://schemas.microsoft.com/office/word/2010/wordprocessingGroup" xmlns:wpi="http://schemas.microsoft.com/office/word/2010/wordprocessingInk" xmlns:wps="http://schemas.microsoft.com/office/word/2010/wordprocessingShape" mc:Ignorable="w14 wp14">
+  <w:p>
+    <w:pPr>
+      <w:pStyle w:val="Header"/>
+      <w:jc w:val="right"/>
+    </w:pPr>
+    <w:r>
+      <w:rPr>
+        <w:rFonts w:ascii="Calibri" w:hAnsi="Calibri"/>
+        <w:color w:val="646464"/>
+        <w:sz w:val="17"/>
+      </w:rPr>
+      <w:t>PROGRAM STUDI SISTEM DAN TEKNOLOGI INFORMASI (SISTEKIN) — FSTI UWG</w:t>
+    </w:r>
+  </w:p>
+</w:hdr>
 </file>
 
 <file path=word/numbering.xml><?xml version="1.0" encoding="utf-8"?>

</xml_diff>